<commit_message>
Documentation for the v1.1 : *Add indications for the prefix command *Add indications for the info command (DM command) *Some little typo corrections (links, spaces,...)
</commit_message>
<xml_diff>
--- a/documentation.docx
+++ b/documentation.docx
@@ -887,6 +887,16 @@
       </w:r>
       <w:r>
         <w:t>).</w:t>
+      </w:r>
+    </w:p>
+    <w:p>
+      <w:pPr>
+        <w:spacing w:before="0"/>
+        <w:ind w:firstLine="0"/>
+        <w:jc w:val="left"/>
+      </w:pPr>
+      <w:r>
+        <w:br w:type="page"/>
       </w:r>
     </w:p>
     <w:p>
@@ -2544,11 +2554,6 @@
       </w:r>
     </w:p>
     <w:p>
-      <w:pPr>
-        <w:rPr>
-          <w:rFonts w:ascii="Courier New" w:hAnsi="Courier New" w:cs="Courier New"/>
-        </w:rPr>
-      </w:pPr>
       <w:r>
         <w:t xml:space="preserve">Cette commande va vous renvoyer au format JSON les paramètres actuels. Attention, cela n’est pas forcément aisé à lire (il est de manière générale déconseillé d’utiliser la commande </w:t>
       </w:r>
@@ -2561,6 +2566,16 @@
       </w:r>
       <w:r>
         <w:t>).</w:t>
+      </w:r>
+    </w:p>
+    <w:p>
+      <w:pPr>
+        <w:spacing w:before="0"/>
+        <w:ind w:firstLine="0"/>
+        <w:jc w:val="left"/>
+      </w:pPr>
+      <w:r>
+        <w:br w:type="page"/>
       </w:r>
     </w:p>
     <w:p>
@@ -2631,7 +2646,19 @@
           <w:rPr>
             <w:rStyle w:val="Lienhypertexte"/>
           </w:rPr>
-          <w:t>send</w:t>
+          <w:t>se</w:t>
+        </w:r>
+        <w:r>
+          <w:rPr>
+            <w:rStyle w:val="Lienhypertexte"/>
+          </w:rPr>
+          <w:t>n</w:t>
+        </w:r>
+        <w:r>
+          <w:rPr>
+            <w:rStyle w:val="Lienhypertexte"/>
+          </w:rPr>
+          <w:t>d</w:t>
         </w:r>
       </w:hyperlink>
     </w:p>
@@ -2648,12 +2675,36 @@
           <w:rStyle w:val="Lienhypertexte"/>
         </w:rPr>
       </w:pPr>
-      <w:hyperlink w:anchor="search_unvalidate" w:history="1">
+      <w:hyperlink w:anchor="_search_unvalidate_-subject:&lt;subject" w:history="1">
         <w:r>
           <w:rPr>
             <w:rStyle w:val="Lienhypertexte"/>
           </w:rPr>
-          <w:t>search_unvalidate</w:t>
+          <w:t>search_un</w:t>
+        </w:r>
+        <w:r>
+          <w:rPr>
+            <w:rStyle w:val="Lienhypertexte"/>
+          </w:rPr>
+          <w:t>v</w:t>
+        </w:r>
+        <w:r>
+          <w:rPr>
+            <w:rStyle w:val="Lienhypertexte"/>
+          </w:rPr>
+          <w:t>a</w:t>
+        </w:r>
+        <w:r>
+          <w:rPr>
+            <w:rStyle w:val="Lienhypertexte"/>
+          </w:rPr>
+          <w:t>l</w:t>
+        </w:r>
+        <w:r>
+          <w:rPr>
+            <w:rStyle w:val="Lienhypertexte"/>
+          </w:rPr>
+          <w:t>idate</w:t>
         </w:r>
       </w:hyperlink>
     </w:p>
@@ -2670,14 +2721,63 @@
           <w:rStyle w:val="Lienhypertexte"/>
         </w:rPr>
       </w:pPr>
-      <w:hyperlink w:anchor="validate" w:history="1">
-        <w:r>
-          <w:rPr>
-            <w:rStyle w:val="Lienhypertexte"/>
-          </w:rPr>
-          <w:t>validate</w:t>
-        </w:r>
-      </w:hyperlink>
+      <w:r>
+        <w:fldChar w:fldCharType="begin"/>
+      </w:r>
+      <w:r>
+        <w:instrText xml:space="preserve"> HYPERLINK  \l "_get_unvalidate_-id:&lt;document’s_id&gt;" </w:instrText>
+      </w:r>
+      <w:r>
+        <w:fldChar w:fldCharType="separate"/>
+      </w:r>
+      <w:r>
+        <w:rPr>
+          <w:rStyle w:val="Lienhypertexte"/>
+        </w:rPr>
+        <w:t>get</w:t>
+      </w:r>
+      <w:r>
+        <w:rPr>
+          <w:rStyle w:val="Lienhypertexte"/>
+        </w:rPr>
+        <w:t>_</w:t>
+      </w:r>
+      <w:r>
+        <w:rPr>
+          <w:rStyle w:val="Lienhypertexte"/>
+        </w:rPr>
+        <w:t>u</w:t>
+      </w:r>
+      <w:r>
+        <w:rPr>
+          <w:rStyle w:val="Lienhypertexte"/>
+        </w:rPr>
+        <w:t>n</w:t>
+      </w:r>
+      <w:r>
+        <w:rPr>
+          <w:rStyle w:val="Lienhypertexte"/>
+        </w:rPr>
+        <w:t>v</w:t>
+      </w:r>
+      <w:r>
+        <w:rPr>
+          <w:rStyle w:val="Lienhypertexte"/>
+        </w:rPr>
+        <w:t>alid</w:t>
+      </w:r>
+      <w:r>
+        <w:rPr>
+          <w:rStyle w:val="Lienhypertexte"/>
+        </w:rPr>
+        <w:t>a</w:t>
+      </w:r>
+      <w:r>
+        <w:rPr>
+          <w:rStyle w:val="Lienhypertexte"/>
+        </w:rPr>
+        <w:t>te</w:t>
+      </w:r>
     </w:p>
     <w:p>
       <w:pPr>
@@ -2692,12 +2792,61 @@
           <w:rStyle w:val="Lienhypertexte"/>
         </w:rPr>
       </w:pPr>
+      <w:r>
+        <w:fldChar w:fldCharType="end"/>
+      </w:r>
+      <w:hyperlink w:anchor="_validate_-id:&lt;document’s_id&gt;" w:history="1">
+        <w:r>
+          <w:rPr>
+            <w:rStyle w:val="Lienhypertexte"/>
+          </w:rPr>
+          <w:t>v</w:t>
+        </w:r>
+        <w:r>
+          <w:rPr>
+            <w:rStyle w:val="Lienhypertexte"/>
+          </w:rPr>
+          <w:t>a</w:t>
+        </w:r>
+        <w:r>
+          <w:rPr>
+            <w:rStyle w:val="Lienhypertexte"/>
+          </w:rPr>
+          <w:t>lidate</w:t>
+        </w:r>
+      </w:hyperlink>
+    </w:p>
+    <w:p>
+      <w:pPr>
+        <w:pStyle w:val="Textbody"/>
+        <w:keepNext/>
+        <w:numPr>
+          <w:ilvl w:val="0"/>
+          <w:numId w:val="8"/>
+        </w:numPr>
+        <w:contextualSpacing/>
+        <w:rPr>
+          <w:rStyle w:val="Lienhypertexte"/>
+        </w:rPr>
+      </w:pPr>
       <w:hyperlink w:anchor="_refuse_-id:&lt;document’s_id&gt;" w:history="1">
         <w:r>
           <w:rPr>
             <w:rStyle w:val="Lienhypertexte"/>
           </w:rPr>
-          <w:t>refuse</w:t>
+          <w:t>refu</w:t>
+        </w:r>
+        <w:r>
+          <w:rPr>
+            <w:rStyle w:val="Lienhypertexte"/>
+          </w:rPr>
+          <w:t>s</w:t>
+        </w:r>
+        <w:r>
+          <w:rPr>
+            <w:rStyle w:val="Lienhypertexte"/>
+          </w:rPr>
+          <w:t>e</w:t>
         </w:r>
       </w:hyperlink>
     </w:p>
@@ -2719,7 +2868,13 @@
           <w:rPr>
             <w:rStyle w:val="Lienhypertexte"/>
           </w:rPr>
-          <w:t>update</w:t>
+          <w:t>updat</w:t>
+        </w:r>
+        <w:r>
+          <w:rPr>
+            <w:rStyle w:val="Lienhypertexte"/>
+          </w:rPr>
+          <w:t>e</w:t>
         </w:r>
       </w:hyperlink>
     </w:p>
@@ -2741,7 +2896,19 @@
           <w:rPr>
             <w:rStyle w:val="Lienhypertexte"/>
           </w:rPr>
-          <w:t>delete</w:t>
+          <w:t>dele</w:t>
+        </w:r>
+        <w:r>
+          <w:rPr>
+            <w:rStyle w:val="Lienhypertexte"/>
+          </w:rPr>
+          <w:t>t</w:t>
+        </w:r>
+        <w:r>
+          <w:rPr>
+            <w:rStyle w:val="Lienhypertexte"/>
+          </w:rPr>
+          <w:t>e</w:t>
         </w:r>
       </w:hyperlink>
     </w:p>
@@ -2925,8 +3092,32 @@
     </w:p>
     <w:p>
       <w:pPr>
+        <w:pStyle w:val="Textbody"/>
+        <w:contextualSpacing/>
+      </w:pPr>
+      <w:r>
+        <w:rPr>
+          <w:i/>
+          <w:iCs/>
+        </w:rPr>
+        <w:t>Short version:</w:t>
+      </w:r>
+      <w:r>
+        <w:t xml:space="preserve"> </w:t>
+      </w:r>
+      <w:r>
+        <w:rPr>
+          <w:rFonts w:ascii="Courier New" w:hAnsi="Courier New" w:cs="Courier New"/>
+        </w:rPr>
+        <w:t>sd</w:t>
+      </w:r>
+    </w:p>
+    <w:p>
+      <w:pPr>
         <w:pStyle w:val="Titre3"/>
       </w:pPr>
+      <w:bookmarkStart w:id="13" w:name="_search_unvalidate_-subject:&lt;subject"/>
+      <w:bookmarkEnd w:id="13"/>
       <w:r>
         <w:tab/>
       </w:r>
@@ -2956,6 +3147,243 @@
       </w:r>
       <w:r>
         <w:t xml:space="preserve">(guide </w:t>
+      </w:r>
+      <w:hyperlink w:anchor="_Envoyer_un_fichier" w:history="1">
+        <w:r>
+          <w:rPr>
+            <w:rStyle w:val="Lienhypertexte"/>
+          </w:rPr>
+          <w:t>he</w:t>
+        </w:r>
+        <w:r>
+          <w:rPr>
+            <w:rStyle w:val="Lienhypertexte"/>
+          </w:rPr>
+          <w:t>r</w:t>
+        </w:r>
+        <w:r>
+          <w:rPr>
+            <w:rStyle w:val="Lienhypertexte"/>
+          </w:rPr>
+          <w:t>e</w:t>
+        </w:r>
+      </w:hyperlink>
+      <w:r>
+        <w:t>).</w:t>
+      </w:r>
+    </w:p>
+    <w:p>
+      <w:pPr>
+        <w:pStyle w:val="Textbody"/>
+        <w:ind w:firstLine="709"/>
+        <w:contextualSpacing/>
+        <w:rPr>
+          <w:color w:val="000000"/>
+        </w:rPr>
+      </w:pPr>
+      <w:r>
+        <w:rPr>
+          <w:color w:val="000000"/>
+        </w:rPr>
+        <w:t>-</w:t>
+      </w:r>
+      <w:r>
+        <w:rPr>
+          <w:b/>
+          <w:bCs/>
+          <w:color w:val="000000"/>
+        </w:rPr>
+        <w:t>subject</w:t>
+      </w:r>
+      <w:r>
+        <w:rPr>
+          <w:color w:val="000000"/>
+        </w:rPr>
+        <w:t xml:space="preserve">: </w:t>
+      </w:r>
+      <w:r>
+        <w:rPr>
+          <w:b/>
+          <w:bCs/>
+          <w:color w:val="000000"/>
+        </w:rPr>
+        <w:t xml:space="preserve">&lt;subject&gt; </w:t>
+      </w:r>
+      <w:r>
+        <w:rPr>
+          <w:color w:val="000000"/>
+        </w:rPr>
+        <w:t>=&gt; Indicate the documents’ subject that you want to see;</w:t>
+      </w:r>
+    </w:p>
+    <w:p>
+      <w:pPr>
+        <w:pStyle w:val="Textbody"/>
+        <w:contextualSpacing/>
+        <w:rPr>
+          <w:rFonts w:ascii="Courier New" w:hAnsi="Courier New" w:cs="Courier New"/>
+        </w:rPr>
+      </w:pPr>
+      <w:r>
+        <w:rPr>
+          <w:i/>
+          <w:iCs/>
+        </w:rPr>
+        <w:t>Short version:</w:t>
+      </w:r>
+      <w:r>
+        <w:t xml:space="preserve"> </w:t>
+      </w:r>
+      <w:r>
+        <w:rPr>
+          <w:rFonts w:ascii="Courier New" w:hAnsi="Courier New" w:cs="Courier New"/>
+        </w:rPr>
+        <w:t>s</w:t>
+      </w:r>
+      <w:r>
+        <w:rPr>
+          <w:rFonts w:ascii="Courier New" w:hAnsi="Courier New" w:cs="Courier New"/>
+        </w:rPr>
+        <w:t>u</w:t>
+      </w:r>
+    </w:p>
+    <w:p>
+      <w:pPr>
+        <w:pStyle w:val="Titre3"/>
+      </w:pPr>
+      <w:bookmarkStart w:id="14" w:name="_get_unvalidate_-id:&lt;document’s_id&gt;"/>
+      <w:bookmarkEnd w:id="14"/>
+      <w:r>
+        <w:t>g</w:t>
+      </w:r>
+      <w:r>
+        <w:t>et</w:t>
+      </w:r>
+      <w:r>
+        <w:t>_unvalidate</w:t>
+      </w:r>
+      <w:r>
+        <w:t xml:space="preserve"> -</w:t>
+      </w:r>
+      <w:r>
+        <w:t>id:&lt;</w:t>
+      </w:r>
+      <w:r>
+        <w:t>document’s id</w:t>
+      </w:r>
+      <w:r>
+        <w:t>&gt;</w:t>
+      </w:r>
+    </w:p>
+    <w:p>
+      <w:pPr>
+        <w:pStyle w:val="Textbody"/>
+        <w:keepNext/>
+        <w:keepLines/>
+        <w:contextualSpacing/>
+      </w:pPr>
+      <w:r>
+        <w:t>Allows you to get the content of a file</w:t>
+      </w:r>
+      <w:r>
+        <w:t xml:space="preserve"> which wait for a validation or which has been refused</w:t>
+      </w:r>
+      <w:r>
+        <w:t xml:space="preserve"> (guide </w:t>
+      </w:r>
+      <w:hyperlink w:anchor="_Envoyer_un_fichier" w:history="1">
+        <w:r>
+          <w:rPr>
+            <w:rStyle w:val="Lienhypertexte"/>
+          </w:rPr>
+          <w:t>h</w:t>
+        </w:r>
+        <w:r>
+          <w:rPr>
+            <w:rStyle w:val="Lienhypertexte"/>
+          </w:rPr>
+          <w:t>e</w:t>
+        </w:r>
+        <w:r>
+          <w:rPr>
+            <w:rStyle w:val="Lienhypertexte"/>
+          </w:rPr>
+          <w:t>re</w:t>
+        </w:r>
+      </w:hyperlink>
+      <w:r>
+        <w:t>).</w:t>
+      </w:r>
+    </w:p>
+    <w:p>
+      <w:pPr>
+        <w:pStyle w:val="Textbody"/>
+        <w:keepNext/>
+        <w:keepLines/>
+        <w:ind w:firstLine="646"/>
+        <w:contextualSpacing/>
+      </w:pPr>
+      <w:r>
+        <w:rPr>
+          <w:b/>
+          <w:bCs/>
+        </w:rPr>
+        <w:t xml:space="preserve">-id: &lt;document’s id&gt; </w:t>
+      </w:r>
+      <w:r>
+        <w:t xml:space="preserve">=&gt; Indicate </w:t>
+      </w:r>
+      <w:r>
+        <w:t>the</w:t>
+      </w:r>
+      <w:r>
+        <w:t xml:space="preserve"> document’s ID.</w:t>
+      </w:r>
+    </w:p>
+    <w:p>
+      <w:pPr>
+        <w:pStyle w:val="Textbody"/>
+        <w:contextualSpacing/>
+      </w:pPr>
+      <w:r>
+        <w:rPr>
+          <w:i/>
+          <w:iCs/>
+        </w:rPr>
+        <w:t>Short version:</w:t>
+      </w:r>
+      <w:r>
+        <w:t xml:space="preserve"> </w:t>
+      </w:r>
+      <w:r>
+        <w:rPr>
+          <w:rFonts w:ascii="Courier New" w:hAnsi="Courier New" w:cs="Courier New"/>
+        </w:rPr>
+        <w:t>gu</w:t>
+      </w:r>
+    </w:p>
+    <w:p>
+      <w:pPr>
+        <w:pStyle w:val="Titre3"/>
+      </w:pPr>
+      <w:bookmarkStart w:id="15" w:name="_validate_-id:&lt;document’s_id&gt;"/>
+      <w:bookmarkEnd w:id="15"/>
+      <w:r>
+        <w:tab/>
+      </w:r>
+      <w:r>
+        <w:t>validate -id:&lt;document’s id&gt;</w:t>
+      </w:r>
+    </w:p>
+    <w:p>
+      <w:pPr>
+        <w:pStyle w:val="Textbody"/>
+        <w:keepNext/>
+        <w:keepLines/>
+        <w:contextualSpacing/>
+      </w:pPr>
+      <w:r>
+        <w:t xml:space="preserve">Allows you to validate a document if it isn’t already refused (guide </w:t>
       </w:r>
       <w:hyperlink w:anchor="_Envoyer_un_fichier" w:history="1">
         <w:r>
@@ -2972,76 +3400,67 @@
     <w:p>
       <w:pPr>
         <w:pStyle w:val="Textbody"/>
+        <w:keepNext/>
+        <w:keepLines/>
         <w:ind w:firstLine="709"/>
         <w:contextualSpacing/>
-        <w:rPr>
-          <w:color w:val="000000"/>
-        </w:rPr>
-      </w:pPr>
-      <w:r>
-        <w:rPr>
-          <w:color w:val="000000"/>
-        </w:rPr>
+      </w:pPr>
+      <w:r>
         <w:t>-</w:t>
       </w:r>
       <w:r>
         <w:rPr>
           <w:b/>
           <w:bCs/>
-          <w:color w:val="000000"/>
-        </w:rPr>
-        <w:t>subject</w:t>
-      </w:r>
-      <w:r>
-        <w:rPr>
-          <w:color w:val="000000"/>
-        </w:rPr>
-        <w:t xml:space="preserve">: </w:t>
-      </w:r>
-      <w:r>
-        <w:rPr>
-          <w:b/>
-          <w:bCs/>
-          <w:color w:val="000000"/>
-        </w:rPr>
-        <w:t xml:space="preserve">&lt;subject&gt; </w:t>
-      </w:r>
-      <w:r>
-        <w:rPr>
-          <w:color w:val="000000"/>
-        </w:rPr>
-        <w:t>=&gt; Indicate the documents’ subject that you want to see;</w:t>
+        </w:rPr>
+        <w:t xml:space="preserve">id: &lt;document’s id&gt; </w:t>
+      </w:r>
+      <w:r>
+        <w:t>=&gt; Indicate the document’s ID.</w:t>
+      </w:r>
+    </w:p>
+    <w:p>
+      <w:pPr>
+        <w:pStyle w:val="Textbody"/>
+        <w:contextualSpacing/>
+      </w:pPr>
+      <w:r>
+        <w:rPr>
+          <w:i/>
+          <w:iCs/>
+        </w:rPr>
+        <w:t>Short version:</w:t>
+      </w:r>
+      <w:r>
+        <w:t xml:space="preserve"> </w:t>
+      </w:r>
+      <w:r>
+        <w:rPr>
+          <w:rFonts w:ascii="Courier New" w:hAnsi="Courier New" w:cs="Courier New"/>
+        </w:rPr>
+        <w:t>v</w:t>
       </w:r>
     </w:p>
     <w:p>
       <w:pPr>
         <w:pStyle w:val="Titre3"/>
       </w:pPr>
+      <w:bookmarkStart w:id="16" w:name="_refuse_-id:&lt;document’s_id&gt;"/>
+      <w:bookmarkEnd w:id="16"/>
       <w:r>
         <w:tab/>
       </w:r>
       <w:r>
-        <w:t>validate -id:&lt;document’s id&gt;</w:t>
-      </w:r>
-    </w:p>
-    <w:p>
-      <w:pPr>
-        <w:pStyle w:val="Textbody"/>
-        <w:contextualSpacing/>
-      </w:pPr>
-      <w:r>
-        <w:t xml:space="preserve">Allows you to validate a document if it isn’t already refused (guide </w:t>
-      </w:r>
-      <w:hyperlink w:anchor="_Envoyer_un_fichier" w:history="1">
-        <w:r>
-          <w:rPr>
-            <w:rStyle w:val="Lienhypertexte"/>
-          </w:rPr>
-          <w:t>here</w:t>
-        </w:r>
-      </w:hyperlink>
-      <w:r>
-        <w:t>).</w:t>
+        <w:t>refuse -id:&lt;document’s id&gt;</w:t>
+      </w:r>
+    </w:p>
+    <w:p>
+      <w:pPr>
+        <w:pStyle w:val="Textbody"/>
+        <w:contextualSpacing/>
+      </w:pPr>
+      <w:r>
+        <w:t>Allows you to refuse a document. A refused document can no more be validated.</w:t>
       </w:r>
     </w:p>
     <w:p>
@@ -3051,39 +3470,64 @@
         <w:contextualSpacing/>
       </w:pPr>
       <w:r>
-        <w:t>-</w:t>
-      </w:r>
-      <w:r>
-        <w:rPr>
-          <w:b/>
-          <w:bCs/>
-        </w:rPr>
-        <w:t xml:space="preserve">id: &lt;document’s id&gt; </w:t>
-      </w:r>
-      <w:r>
-        <w:t>=&gt; Indicate the document’s ID.</w:t>
+        <w:rPr>
+          <w:b/>
+          <w:bCs/>
+        </w:rPr>
+        <w:t xml:space="preserve">-id: &lt;document’s id&gt; </w:t>
+      </w:r>
+      <w:r>
+        <w:t xml:space="preserve">=&gt; Indicate </w:t>
+      </w:r>
+      <w:r>
+        <w:t>the</w:t>
+      </w:r>
+      <w:r>
+        <w:t xml:space="preserve"> document’s ID.</w:t>
+      </w:r>
+    </w:p>
+    <w:p>
+      <w:pPr>
+        <w:pStyle w:val="Textbody"/>
+        <w:contextualSpacing/>
+      </w:pPr>
+      <w:r>
+        <w:rPr>
+          <w:i/>
+          <w:iCs/>
+        </w:rPr>
+        <w:t>Short version:</w:t>
+      </w:r>
+      <w:r>
+        <w:t xml:space="preserve"> </w:t>
+      </w:r>
+      <w:r>
+        <w:rPr>
+          <w:rFonts w:ascii="Courier New" w:hAnsi="Courier New" w:cs="Courier New"/>
+        </w:rPr>
+        <w:t>r</w:t>
       </w:r>
     </w:p>
     <w:p>
       <w:pPr>
         <w:pStyle w:val="Titre3"/>
       </w:pPr>
-      <w:bookmarkStart w:id="13" w:name="_refuse_-id:&lt;document’s_id&gt;"/>
-      <w:bookmarkEnd w:id="13"/>
+      <w:bookmarkStart w:id="17" w:name="_update_-id:&lt;document’s_id&gt;"/>
+      <w:bookmarkEnd w:id="17"/>
       <w:r>
         <w:tab/>
       </w:r>
       <w:r>
-        <w:t>refuse -id:&lt;document’s id&gt;</w:t>
-      </w:r>
-    </w:p>
-    <w:p>
-      <w:pPr>
-        <w:pStyle w:val="Textbody"/>
-        <w:contextualSpacing/>
-      </w:pPr>
-      <w:r>
-        <w:t>Allows you to refuse a document. A refused document can no more be validated.</w:t>
+        <w:t>update -id:&lt;document’s id&gt;</w:t>
+      </w:r>
+    </w:p>
+    <w:p>
+      <w:pPr>
+        <w:pStyle w:val="Textbody"/>
+        <w:contextualSpacing/>
+      </w:pPr>
+      <w:r>
+        <w:t xml:space="preserve">Allows to update one of your documents. </w:t>
       </w:r>
     </w:p>
     <w:p>
@@ -3111,55 +3555,32 @@
     </w:p>
     <w:p>
       <w:pPr>
+        <w:pStyle w:val="Textbody"/>
+        <w:contextualSpacing/>
+      </w:pPr>
+      <w:r>
+        <w:rPr>
+          <w:i/>
+          <w:iCs/>
+        </w:rPr>
+        <w:t>Short version:</w:t>
+      </w:r>
+      <w:r>
+        <w:t xml:space="preserve"> </w:t>
+      </w:r>
+      <w:r>
+        <w:rPr>
+          <w:rFonts w:ascii="Courier New" w:hAnsi="Courier New" w:cs="Courier New"/>
+        </w:rPr>
+        <w:t>up</w:t>
+      </w:r>
+    </w:p>
+    <w:p>
+      <w:pPr>
         <w:pStyle w:val="Titre3"/>
       </w:pPr>
-      <w:bookmarkStart w:id="14" w:name="_update_-id:&lt;document’s_id&gt;"/>
-      <w:bookmarkEnd w:id="14"/>
-      <w:r>
-        <w:tab/>
-      </w:r>
-      <w:r>
-        <w:t>update -id:&lt;document’s id&gt;</w:t>
-      </w:r>
-    </w:p>
-    <w:p>
-      <w:pPr>
-        <w:pStyle w:val="Textbody"/>
-        <w:contextualSpacing/>
-      </w:pPr>
-      <w:r>
-        <w:t xml:space="preserve">Allows to update one of your documents. </w:t>
-      </w:r>
-    </w:p>
-    <w:p>
-      <w:pPr>
-        <w:pStyle w:val="Textbody"/>
-        <w:ind w:firstLine="709"/>
-        <w:contextualSpacing/>
-      </w:pPr>
-      <w:r>
-        <w:rPr>
-          <w:b/>
-          <w:bCs/>
-        </w:rPr>
-        <w:t xml:space="preserve">-id: &lt;document’s id&gt; </w:t>
-      </w:r>
-      <w:r>
-        <w:t xml:space="preserve">=&gt; Indicate </w:t>
-      </w:r>
-      <w:r>
-        <w:t>the</w:t>
-      </w:r>
-      <w:r>
-        <w:t xml:space="preserve"> document’s ID.</w:t>
-      </w:r>
-    </w:p>
-    <w:p>
-      <w:pPr>
-        <w:pStyle w:val="Titre3"/>
-      </w:pPr>
-      <w:bookmarkStart w:id="15" w:name="_delete_-id:&lt;document’s_id&gt;"/>
-      <w:bookmarkEnd w:id="15"/>
+      <w:bookmarkStart w:id="18" w:name="_delete_-id:&lt;document’s_id&gt;"/>
+      <w:bookmarkEnd w:id="18"/>
       <w:r>
         <w:tab/>
       </w:r>
@@ -3197,6 +3618,28 @@
       </w:r>
       <w:r>
         <w:t xml:space="preserve"> document’s ID.</w:t>
+      </w:r>
+    </w:p>
+    <w:p>
+      <w:pPr>
+        <w:pStyle w:val="Textbody"/>
+        <w:contextualSpacing/>
+      </w:pPr>
+      <w:r>
+        <w:rPr>
+          <w:i/>
+          <w:iCs/>
+        </w:rPr>
+        <w:t>Short version:</w:t>
+      </w:r>
+      <w:r>
+        <w:t xml:space="preserve"> </w:t>
+      </w:r>
+      <w:r>
+        <w:rPr>
+          <w:rFonts w:ascii="Courier New" w:hAnsi="Courier New" w:cs="Courier New"/>
+        </w:rPr>
+        <w:t>del</w:t>
       </w:r>
     </w:p>
     <w:p>
@@ -3287,8 +3730,8 @@
       <w:pPr>
         <w:pStyle w:val="Titre3"/>
       </w:pPr>
-      <w:bookmarkStart w:id="16" w:name="_get_-id:&lt;document’s_id&gt;"/>
-      <w:bookmarkEnd w:id="16"/>
+      <w:bookmarkStart w:id="19" w:name="_get_-id:&lt;document’s_id&gt;"/>
+      <w:bookmarkEnd w:id="19"/>
       <w:r>
         <w:t>get</w:t>
       </w:r>
@@ -3350,10 +3793,32 @@
     </w:p>
     <w:p>
       <w:pPr>
+        <w:pStyle w:val="Textbody"/>
+        <w:contextualSpacing/>
+      </w:pPr>
+      <w:r>
+        <w:rPr>
+          <w:i/>
+          <w:iCs/>
+        </w:rPr>
+        <w:t>Short version:</w:t>
+      </w:r>
+      <w:r>
+        <w:t xml:space="preserve"> </w:t>
+      </w:r>
+      <w:r>
+        <w:rPr>
+          <w:rFonts w:ascii="Courier New" w:hAnsi="Courier New" w:cs="Courier New"/>
+        </w:rPr>
+        <w:t>g</w:t>
+      </w:r>
+    </w:p>
+    <w:p>
+      <w:pPr>
         <w:pStyle w:val="Titre3"/>
       </w:pPr>
-      <w:bookmarkStart w:id="17" w:name="_search_[-subject:&lt;subject&gt;]_[-level"/>
-      <w:bookmarkEnd w:id="17"/>
+      <w:bookmarkStart w:id="20" w:name="_search_[-subject:&lt;subject&gt;]_[-level"/>
+      <w:bookmarkEnd w:id="20"/>
       <w:r>
         <w:tab/>
       </w:r>
@@ -3385,6 +3850,18 @@
           <w:color w:val="000000"/>
         </w:rPr>
         <w:t>Allows you to</w:t>
+      </w:r>
+      <w:r>
+        <w:rPr>
+          <w:color w:val="000000"/>
+        </w:rPr>
+        <w:t xml:space="preserve"> </w:t>
+      </w:r>
+      <w:r>
+        <w:rPr>
+          <w:color w:val="000000"/>
+        </w:rPr>
+        <w:t>search</w:t>
       </w:r>
       <w:r>
         <w:rPr>
@@ -3461,6 +3938,8 @@
     <w:p>
       <w:pPr>
         <w:pStyle w:val="Textbody"/>
+        <w:keepNext/>
+        <w:keepLines/>
         <w:ind w:left="709"/>
         <w:contextualSpacing/>
         <w:rPr>
@@ -3522,6 +4001,28 @@
           <w:color w:val="000000"/>
         </w:rPr>
         <w:t>. By default, your level role.</w:t>
+      </w:r>
+    </w:p>
+    <w:p>
+      <w:pPr>
+        <w:pStyle w:val="Textbody"/>
+        <w:contextualSpacing/>
+      </w:pPr>
+      <w:r>
+        <w:rPr>
+          <w:i/>
+          <w:iCs/>
+        </w:rPr>
+        <w:t>Short version:</w:t>
+      </w:r>
+      <w:r>
+        <w:t xml:space="preserve"> </w:t>
+      </w:r>
+      <w:r>
+        <w:rPr>
+          <w:rFonts w:ascii="Courier New" w:hAnsi="Courier New" w:cs="Courier New"/>
+        </w:rPr>
+        <w:t>s</w:t>
       </w:r>
     </w:p>
     <w:p>
@@ -3728,8 +4229,8 @@
       <w:pPr>
         <w:pStyle w:val="Titre3"/>
       </w:pPr>
-      <w:bookmarkStart w:id="18" w:name="_url_-link:_&lt;GDrive"/>
-      <w:bookmarkEnd w:id="18"/>
+      <w:bookmarkStart w:id="21" w:name="_url_-link:_&lt;GDrive"/>
+      <w:bookmarkEnd w:id="21"/>
       <w:r>
         <w:t>url</w:t>
       </w:r>
@@ -3771,8 +4272,8 @@
       <w:pPr>
         <w:pStyle w:val="Titre3"/>
       </w:pPr>
-      <w:bookmarkStart w:id="19" w:name="_create_settings_[-subject:&lt;subject_"/>
-      <w:bookmarkEnd w:id="19"/>
+      <w:bookmarkStart w:id="22" w:name="_create_settings_[-subject:&lt;subject_"/>
+      <w:bookmarkEnd w:id="22"/>
       <w:r>
         <w:tab/>
       </w:r>
@@ -3786,29 +4287,16 @@
         <w:t>[</w:t>
       </w:r>
       <w:r>
-        <w:t>-subject:&lt;</w:t>
-      </w:r>
-      <w:proofErr w:type="spellStart"/>
-      <w:r>
-        <w:t>subject</w:t>
+        <w:t>-subject:&lt;subject</w:t>
       </w:r>
       <w:r>
         <w:t>_name</w:t>
       </w:r>
-      <w:proofErr w:type="spellEnd"/>
       <w:r>
         <w:t>&gt;</w:t>
       </w:r>
       <w:r>
-        <w:t>] [-level:&lt;</w:t>
-      </w:r>
-      <w:proofErr w:type="spellStart"/>
-      <w:r>
-        <w:t>level_name</w:t>
-      </w:r>
-      <w:proofErr w:type="spellEnd"/>
-      <w:r>
-        <w:t>&gt;] - @&lt;Role&gt; [#&lt;Channel&gt;</w:t>
+        <w:t>] [-level:&lt;level_name&gt;] - @&lt;Role&gt; [#&lt;Channel&gt;</w:t>
       </w:r>
     </w:p>
     <w:p>
@@ -3880,23 +4368,7 @@
           <w:b/>
           <w:bCs/>
         </w:rPr>
-        <w:t>-subject: &lt;</w:t>
-      </w:r>
-      <w:proofErr w:type="spellStart"/>
-      <w:r>
-        <w:rPr>
-          <w:b/>
-          <w:bCs/>
-        </w:rPr>
-        <w:t>subject_name</w:t>
-      </w:r>
-      <w:proofErr w:type="spellEnd"/>
-      <w:r>
-        <w:rPr>
-          <w:b/>
-          <w:bCs/>
-        </w:rPr>
-        <w:t xml:space="preserve">&gt; </w:t>
+        <w:t xml:space="preserve">-subject: &lt;subject_name&gt; </w:t>
       </w:r>
       <w:r>
         <w:t>=&gt; Use it just if you want to create a subject. Indicate the subject’s name.</w:t>
@@ -3916,23 +4388,7 @@
           <w:b/>
           <w:bCs/>
         </w:rPr>
-        <w:t>-level: &lt;</w:t>
-      </w:r>
-      <w:proofErr w:type="spellStart"/>
-      <w:r>
-        <w:rPr>
-          <w:b/>
-          <w:bCs/>
-        </w:rPr>
-        <w:t>level_name</w:t>
-      </w:r>
-      <w:proofErr w:type="spellEnd"/>
-      <w:r>
-        <w:rPr>
-          <w:b/>
-          <w:bCs/>
-        </w:rPr>
-        <w:t xml:space="preserve">&gt; </w:t>
+        <w:t xml:space="preserve">-level: &lt;level_name&gt; </w:t>
       </w:r>
       <w:r>
         <w:t>=&gt; Use it just if you want to create a level. Indicate the level’s name.</w:t>
@@ -3974,37 +4430,46 @@
     </w:p>
     <w:p>
       <w:pPr>
+        <w:pStyle w:val="Textbody"/>
+        <w:contextualSpacing/>
+      </w:pPr>
+      <w:r>
+        <w:rPr>
+          <w:i/>
+          <w:iCs/>
+        </w:rPr>
+        <w:t>Short version:</w:t>
+      </w:r>
+      <w:r>
+        <w:t xml:space="preserve"> </w:t>
+      </w:r>
+      <w:r>
+        <w:rPr>
+          <w:rFonts w:ascii="Courier New" w:hAnsi="Courier New" w:cs="Courier New"/>
+        </w:rPr>
+        <w:t>cs</w:t>
+      </w:r>
+    </w:p>
+    <w:p>
+      <w:pPr>
         <w:pStyle w:val="Titre3"/>
       </w:pPr>
-      <w:bookmarkStart w:id="20" w:name="_modify_settings_-subject:&lt;subject_n"/>
-      <w:bookmarkEnd w:id="20"/>
+      <w:bookmarkStart w:id="23" w:name="_modify_settings_-subject:&lt;subject_n"/>
+      <w:bookmarkEnd w:id="23"/>
       <w:r>
         <w:t>modify_settings</w:t>
       </w:r>
       <w:r>
-        <w:t xml:space="preserve"> -subject:&lt;</w:t>
-      </w:r>
-      <w:proofErr w:type="spellStart"/>
-      <w:r>
-        <w:t>subject</w:t>
+        <w:t xml:space="preserve"> -subject:&lt;subject</w:t>
       </w:r>
       <w:r>
         <w:t>_name</w:t>
       </w:r>
-      <w:proofErr w:type="spellEnd"/>
       <w:r>
         <w:t>&gt;</w:t>
       </w:r>
       <w:r>
-        <w:t xml:space="preserve"> [-name:&lt;</w:t>
-      </w:r>
-      <w:proofErr w:type="spellStart"/>
-      <w:r>
-        <w:t>new_name</w:t>
-      </w:r>
-      <w:proofErr w:type="spellEnd"/>
-      <w:r>
-        <w:t>] – [@&lt;Role&gt;] [#&lt;Channel&gt;</w:t>
+        <w:t xml:space="preserve"> [-name:&lt;new_name] – [@&lt;Role&gt;] [#&lt;Channel&gt;</w:t>
       </w:r>
     </w:p>
     <w:p>
@@ -4067,23 +4532,7 @@
           <w:b/>
           <w:bCs/>
         </w:rPr>
-        <w:t>-subject: &lt;</w:t>
-      </w:r>
-      <w:proofErr w:type="spellStart"/>
-      <w:r>
-        <w:rPr>
-          <w:b/>
-          <w:bCs/>
-        </w:rPr>
-        <w:t>subject_name</w:t>
-      </w:r>
-      <w:proofErr w:type="spellEnd"/>
-      <w:r>
-        <w:rPr>
-          <w:b/>
-          <w:bCs/>
-        </w:rPr>
-        <w:t xml:space="preserve">&gt; </w:t>
+        <w:t xml:space="preserve">-subject: &lt;subject_name&gt; </w:t>
       </w:r>
       <w:r>
         <w:t>=&gt; Indicate the actual subject’s name you want to modify.</w:t>
@@ -4168,23 +4617,37 @@
         <w:t xml:space="preserve">- #&lt;Channel&gt; </w:t>
       </w:r>
       <w:r>
-        <w:t xml:space="preserve">=&gt; Indicate an existing </w:t>
-      </w:r>
-      <w:proofErr w:type="spellStart"/>
-      <w:r>
-        <w:t>TextChannel</w:t>
-      </w:r>
-      <w:proofErr w:type="spellEnd"/>
-      <w:r>
-        <w:t>, it will be added to the channels’ list of this subject if it’s not already in the list, else it will be deleted from the list.</w:t>
+        <w:t>=&gt; Indicate an existing TextChannel, it will be added to the channels’ list of this subject if it’s not already in the list, else it will be deleted from the list.</w:t>
+      </w:r>
+    </w:p>
+    <w:p>
+      <w:pPr>
+        <w:pStyle w:val="Textbody"/>
+        <w:contextualSpacing/>
+      </w:pPr>
+      <w:r>
+        <w:rPr>
+          <w:i/>
+          <w:iCs/>
+        </w:rPr>
+        <w:t>Short version:</w:t>
+      </w:r>
+      <w:r>
+        <w:t xml:space="preserve"> </w:t>
+      </w:r>
+      <w:r>
+        <w:rPr>
+          <w:rFonts w:ascii="Courier New" w:hAnsi="Courier New" w:cs="Courier New"/>
+        </w:rPr>
+        <w:t>ms -subject</w:t>
       </w:r>
     </w:p>
     <w:p>
       <w:pPr>
         <w:pStyle w:val="Titre3"/>
       </w:pPr>
-      <w:bookmarkStart w:id="21" w:name="_modify_settings_-level:&lt;level_name&gt;"/>
-      <w:bookmarkEnd w:id="21"/>
+      <w:bookmarkStart w:id="24" w:name="_modify_settings_-level:&lt;level_name&gt;"/>
+      <w:bookmarkEnd w:id="24"/>
       <w:r>
         <w:t>modify_settings</w:t>
       </w:r>
@@ -4197,24 +4660,14 @@
       <w:r>
         <w:t>:&lt;</w:t>
       </w:r>
-      <w:proofErr w:type="spellStart"/>
       <w:r>
         <w:t>level_name</w:t>
       </w:r>
-      <w:proofErr w:type="spellEnd"/>
       <w:r>
         <w:t>&gt;</w:t>
       </w:r>
       <w:r>
-        <w:t xml:space="preserve"> [-name:&lt;</w:t>
-      </w:r>
-      <w:proofErr w:type="spellStart"/>
-      <w:r>
-        <w:t>new_name</w:t>
-      </w:r>
-      <w:proofErr w:type="spellEnd"/>
-      <w:r>
-        <w:t>] – [@&lt;Role&gt;]</w:t>
+        <w:t xml:space="preserve"> [-name:&lt;new_name] – [@&lt;Role&gt;]</w:t>
       </w:r>
     </w:p>
     <w:p>
@@ -4235,21 +4688,7 @@
         <w:rPr>
           <w:color w:val="000000"/>
         </w:rPr>
-        <w:t xml:space="preserve">to modify level’s name or </w:t>
-      </w:r>
-      <w:proofErr w:type="gramStart"/>
-      <w:r>
-        <w:rPr>
-          <w:color w:val="000000"/>
-        </w:rPr>
-        <w:t>bindings :</w:t>
-      </w:r>
-      <w:proofErr w:type="gramEnd"/>
-      <w:r>
-        <w:rPr>
-          <w:color w:val="000000"/>
-        </w:rPr>
-        <w:t xml:space="preserve"> channels and role  (more information </w:t>
+        <w:t xml:space="preserve">to modify level’s name or bindings : channels and role  (more information </w:t>
       </w:r>
       <w:hyperlink w:anchor="_Domaines,_niveaux_et" w:history="1">
         <w:r>
@@ -4277,23 +4716,7 @@
           <w:b/>
           <w:bCs/>
         </w:rPr>
-        <w:t>-subject: &lt;</w:t>
-      </w:r>
-      <w:proofErr w:type="spellStart"/>
-      <w:r>
-        <w:rPr>
-          <w:b/>
-          <w:bCs/>
-        </w:rPr>
-        <w:t>level_name</w:t>
-      </w:r>
-      <w:proofErr w:type="spellEnd"/>
-      <w:r>
-        <w:rPr>
-          <w:b/>
-          <w:bCs/>
-        </w:rPr>
-        <w:t xml:space="preserve">&gt; </w:t>
+        <w:t xml:space="preserve">-subject: &lt;level_name&gt; </w:t>
       </w:r>
       <w:r>
         <w:t>=&gt; Indicate the actual level’s name you want to modify.</w:t>
@@ -4313,23 +4736,7 @@
           <w:b/>
           <w:bCs/>
         </w:rPr>
-        <w:t>-name: &lt;</w:t>
-      </w:r>
-      <w:proofErr w:type="spellStart"/>
-      <w:r>
-        <w:rPr>
-          <w:b/>
-          <w:bCs/>
-        </w:rPr>
-        <w:t>new_name</w:t>
-      </w:r>
-      <w:proofErr w:type="spellEnd"/>
-      <w:r>
-        <w:rPr>
-          <w:b/>
-          <w:bCs/>
-        </w:rPr>
-        <w:t xml:space="preserve">&gt; </w:t>
+        <w:t xml:space="preserve">-name: &lt;new_name&gt; </w:t>
       </w:r>
       <w:r>
         <w:t>=&gt; Indicate the new name of the level.</w:t>
@@ -4354,10 +4761,32 @@
     </w:p>
     <w:p>
       <w:pPr>
+        <w:pStyle w:val="Textbody"/>
+        <w:contextualSpacing/>
+      </w:pPr>
+      <w:r>
+        <w:rPr>
+          <w:i/>
+          <w:iCs/>
+        </w:rPr>
+        <w:t>Short version:</w:t>
+      </w:r>
+      <w:r>
+        <w:t xml:space="preserve"> </w:t>
+      </w:r>
+      <w:r>
+        <w:rPr>
+          <w:rFonts w:ascii="Courier New" w:hAnsi="Courier New" w:cs="Courier New"/>
+        </w:rPr>
+        <w:t>ms -level</w:t>
+      </w:r>
+    </w:p>
+    <w:p>
+      <w:pPr>
         <w:pStyle w:val="Titre3"/>
       </w:pPr>
-      <w:bookmarkStart w:id="22" w:name="_modify_settings_-prof_–"/>
-      <w:bookmarkEnd w:id="22"/>
+      <w:bookmarkStart w:id="25" w:name="_modify_settings_-prof_–"/>
+      <w:bookmarkEnd w:id="25"/>
       <w:r>
         <w:t>modify_settings</w:t>
       </w:r>
@@ -4445,23 +4874,37 @@
         <w:t xml:space="preserve">- #&lt;Channel&gt; </w:t>
       </w:r>
       <w:r>
-        <w:t xml:space="preserve">=&gt; Indicate an existing </w:t>
-      </w:r>
-      <w:proofErr w:type="spellStart"/>
-      <w:r>
-        <w:t>TextChannel</w:t>
-      </w:r>
-      <w:proofErr w:type="spellEnd"/>
-      <w:r>
-        <w:t>, it will be added to the channels’ list of this subject if it’s not already in the list, else it will be deleted from the list.</w:t>
+        <w:t>=&gt; Indicate an existing TextChannel, it will be added to the channels’ list of this subject if it’s not already in the list, else it will be deleted from the list.</w:t>
+      </w:r>
+    </w:p>
+    <w:p>
+      <w:pPr>
+        <w:pStyle w:val="Textbody"/>
+        <w:contextualSpacing/>
+      </w:pPr>
+      <w:r>
+        <w:rPr>
+          <w:i/>
+          <w:iCs/>
+        </w:rPr>
+        <w:t>Short version:</w:t>
+      </w:r>
+      <w:r>
+        <w:t xml:space="preserve"> </w:t>
+      </w:r>
+      <w:r>
+        <w:rPr>
+          <w:rFonts w:ascii="Courier New" w:hAnsi="Courier New" w:cs="Courier New"/>
+        </w:rPr>
+        <w:t>ms -gobalc</w:t>
       </w:r>
     </w:p>
     <w:p>
       <w:pPr>
         <w:pStyle w:val="Titre3"/>
       </w:pPr>
-      <w:bookmarkStart w:id="23" w:name="_modify_settings_-validation:&lt;true|f"/>
-      <w:bookmarkEnd w:id="23"/>
+      <w:bookmarkStart w:id="26" w:name="_modify_settings_-validation:&lt;true|f"/>
+      <w:bookmarkEnd w:id="26"/>
       <w:r>
         <w:t>modify_settings</w:t>
       </w:r>
@@ -4469,15 +4912,7 @@
         <w:t xml:space="preserve"> -</w:t>
       </w:r>
       <w:r>
-        <w:t>validation:&lt;</w:t>
-      </w:r>
-      <w:proofErr w:type="spellStart"/>
-      <w:r>
-        <w:t>true|false</w:t>
-      </w:r>
-      <w:proofErr w:type="spellEnd"/>
-      <w:r>
-        <w:t>&gt;</w:t>
+        <w:t>validation:&lt;true|false&gt;</w:t>
       </w:r>
     </w:p>
     <w:p>
@@ -4537,23 +4972,7 @@
           <w:b/>
           <w:bCs/>
         </w:rPr>
-        <w:t>-validation: &lt;</w:t>
-      </w:r>
-      <w:proofErr w:type="spellStart"/>
-      <w:r>
-        <w:rPr>
-          <w:b/>
-          <w:bCs/>
-        </w:rPr>
-        <w:t>true|false</w:t>
-      </w:r>
-      <w:proofErr w:type="spellEnd"/>
-      <w:r>
-        <w:rPr>
-          <w:b/>
-          <w:bCs/>
-        </w:rPr>
-        <w:t xml:space="preserve">&gt; </w:t>
+        <w:t xml:space="preserve">-validation: &lt;true|false&gt; </w:t>
       </w:r>
       <w:r>
         <w:t>=&gt; Indicate ‘true’ (enable) or ‘false’(disable).</w:t>
@@ -4561,6 +4980,28 @@
     </w:p>
     <w:p>
       <w:pPr>
+        <w:pStyle w:val="Textbody"/>
+        <w:contextualSpacing/>
+      </w:pPr>
+      <w:r>
+        <w:rPr>
+          <w:i/>
+          <w:iCs/>
+        </w:rPr>
+        <w:t>Short version:</w:t>
+      </w:r>
+      <w:r>
+        <w:t xml:space="preserve"> </w:t>
+      </w:r>
+      <w:r>
+        <w:rPr>
+          <w:rFonts w:ascii="Courier New" w:hAnsi="Courier New" w:cs="Courier New"/>
+        </w:rPr>
+        <w:t>ms -validation</w:t>
+      </w:r>
+    </w:p>
+    <w:p>
+      <w:pPr>
         <w:pStyle w:val="Titre3"/>
       </w:pPr>
       <w:r>
@@ -4570,15 +5011,7 @@
         <w:t xml:space="preserve"> -</w:t>
       </w:r>
       <w:r>
-        <w:t>refuse:&lt;</w:t>
-      </w:r>
-      <w:proofErr w:type="spellStart"/>
-      <w:r>
-        <w:t>true|false</w:t>
-      </w:r>
-      <w:proofErr w:type="spellEnd"/>
-      <w:r>
-        <w:t>&gt;</w:t>
+        <w:t>refuse:&lt;true|false&gt;</w:t>
       </w:r>
     </w:p>
     <w:p>
@@ -4638,23 +5071,7 @@
           <w:b/>
           <w:bCs/>
         </w:rPr>
-        <w:t>-validation: &lt;</w:t>
-      </w:r>
-      <w:proofErr w:type="spellStart"/>
-      <w:r>
-        <w:rPr>
-          <w:b/>
-          <w:bCs/>
-        </w:rPr>
-        <w:t>true|false</w:t>
-      </w:r>
-      <w:proofErr w:type="spellEnd"/>
-      <w:r>
-        <w:rPr>
-          <w:b/>
-          <w:bCs/>
-        </w:rPr>
-        <w:t xml:space="preserve">&gt; </w:t>
+        <w:t xml:space="preserve">-validation: &lt;true|false&gt; </w:t>
       </w:r>
       <w:r>
         <w:t>=&gt; Indicate ‘true’ (enable) or ‘false’(disable).</w:t>
@@ -4662,10 +5079,32 @@
     </w:p>
     <w:p>
       <w:pPr>
+        <w:pStyle w:val="Textbody"/>
+        <w:contextualSpacing/>
+      </w:pPr>
+      <w:r>
+        <w:rPr>
+          <w:i/>
+          <w:iCs/>
+        </w:rPr>
+        <w:t>Short version:</w:t>
+      </w:r>
+      <w:r>
+        <w:t xml:space="preserve"> </w:t>
+      </w:r>
+      <w:r>
+        <w:rPr>
+          <w:rFonts w:ascii="Courier New" w:hAnsi="Courier New" w:cs="Courier New"/>
+        </w:rPr>
+        <w:t>ms -refuse</w:t>
+      </w:r>
+    </w:p>
+    <w:p>
+      <w:pPr>
         <w:pStyle w:val="Titre3"/>
       </w:pPr>
-      <w:bookmarkStart w:id="24" w:name="_handle_settings_[-view:&lt;saved|run&gt;]"/>
-      <w:bookmarkEnd w:id="24"/>
+      <w:bookmarkStart w:id="27" w:name="_handle_settings_[-view:&lt;saved|run&gt;]"/>
+      <w:bookmarkEnd w:id="27"/>
       <w:r>
         <w:t>handle_settings</w:t>
       </w:r>
@@ -4684,11 +5123,9 @@
       <w:r>
         <w:t>:&lt;</w:t>
       </w:r>
-      <w:proofErr w:type="spellStart"/>
       <w:r>
         <w:t>saved|run</w:t>
       </w:r>
-      <w:proofErr w:type="spellEnd"/>
       <w:r>
         <w:t>&gt;</w:t>
       </w:r>
@@ -4744,23 +5181,7 @@
           <w:b/>
           <w:bCs/>
         </w:rPr>
-        <w:t>-view: &lt;</w:t>
-      </w:r>
-      <w:proofErr w:type="spellStart"/>
-      <w:r>
-        <w:rPr>
-          <w:b/>
-          <w:bCs/>
-        </w:rPr>
-        <w:t>saved|run</w:t>
-      </w:r>
-      <w:proofErr w:type="spellEnd"/>
-      <w:r>
-        <w:rPr>
-          <w:b/>
-          <w:bCs/>
-        </w:rPr>
-        <w:t xml:space="preserve">&gt; </w:t>
+        <w:t xml:space="preserve">-view: &lt;saved|run&gt; </w:t>
       </w:r>
       <w:r>
         <w:t>=&gt; Indicate ‘saved’ to get the settings saved on the disk and ‘run’ for the settings in the RAM. It’s in JSON.</w:t>
@@ -4802,6 +5223,278 @@
       </w:r>
       <w:r>
         <w:t>=&gt; Save the settings in the RAM onto the disk.</w:t>
+      </w:r>
+    </w:p>
+    <w:p>
+      <w:pPr>
+        <w:pStyle w:val="Textbody"/>
+        <w:contextualSpacing/>
+        <w:rPr>
+          <w:rFonts w:ascii="Courier New" w:hAnsi="Courier New" w:cs="Courier New"/>
+        </w:rPr>
+      </w:pPr>
+      <w:r>
+        <w:rPr>
+          <w:i/>
+          <w:iCs/>
+        </w:rPr>
+        <w:t>Short version:</w:t>
+      </w:r>
+      <w:r>
+        <w:t xml:space="preserve"> </w:t>
+      </w:r>
+      <w:r>
+        <w:rPr>
+          <w:rFonts w:ascii="Courier New" w:hAnsi="Courier New" w:cs="Courier New"/>
+        </w:rPr>
+        <w:t>hs</w:t>
+      </w:r>
+    </w:p>
+    <w:p>
+      <w:pPr>
+        <w:pStyle w:val="Titre3"/>
+      </w:pPr>
+      <w:r>
+        <w:t>prefix</w:t>
+      </w:r>
+      <w:r>
+        <w:t xml:space="preserve"> -</w:t>
+      </w:r>
+      <w:r>
+        <w:t>&lt;new_prefix</w:t>
+      </w:r>
+      <w:r>
+        <w:t>&gt;</w:t>
+      </w:r>
+    </w:p>
+    <w:p>
+      <w:pPr>
+        <w:pStyle w:val="Textbody"/>
+        <w:contextualSpacing/>
+      </w:pPr>
+      <w:r>
+        <w:rPr>
+          <w:color w:val="000000"/>
+        </w:rPr>
+        <w:t xml:space="preserve">Allows </w:t>
+      </w:r>
+      <w:r>
+        <w:rPr>
+          <w:color w:val="000000"/>
+        </w:rPr>
+        <w:t>you to change the prefix of your bot.</w:t>
+      </w:r>
+      <w:r>
+        <w:rPr>
+          <w:color w:val="000000"/>
+        </w:rPr>
+        <w:t xml:space="preserve"> It’s by default ‘Biblio:’ (</w:t>
+      </w:r>
+      <w:r>
+        <w:rPr>
+          <w:color w:val="000000"/>
+        </w:rPr>
+        <w:t>yes,</w:t>
+      </w:r>
+      <w:r>
+        <w:rPr>
+          <w:color w:val="000000"/>
+        </w:rPr>
+        <w:t xml:space="preserve"> it’s long)</w:t>
+      </w:r>
+    </w:p>
+    <w:p>
+      <w:pPr>
+        <w:pStyle w:val="Textbody"/>
+        <w:ind w:left="646"/>
+        <w:contextualSpacing/>
+      </w:pPr>
+      <w:r>
+        <w:rPr>
+          <w:b/>
+          <w:bCs/>
+        </w:rPr>
+        <w:t>-&lt;</w:t>
+      </w:r>
+      <w:r>
+        <w:rPr>
+          <w:b/>
+          <w:bCs/>
+        </w:rPr>
+        <w:t>new_prefix</w:t>
+      </w:r>
+      <w:r>
+        <w:rPr>
+          <w:b/>
+          <w:bCs/>
+        </w:rPr>
+        <w:t xml:space="preserve">&gt; </w:t>
+      </w:r>
+      <w:r>
+        <w:t xml:space="preserve">=&gt; Indicate </w:t>
+      </w:r>
+      <w:r>
+        <w:t>the new desired</w:t>
+      </w:r>
+      <w:r>
+        <w:t>.</w:t>
+      </w:r>
+    </w:p>
+    <w:p>
+      <w:pPr>
+        <w:pStyle w:val="Titre2"/>
+      </w:pPr>
+      <w:r>
+        <w:t>DM commands</w:t>
+      </w:r>
+    </w:p>
+    <w:p>
+      <w:pPr>
+        <w:pStyle w:val="Textbody"/>
+        <w:ind w:firstLine="357"/>
+        <w:contextualSpacing/>
+      </w:pPr>
+      <w:r>
+        <w:t xml:space="preserve">Here are the commands which can be sent to the bot </w:t>
+      </w:r>
+      <w:r>
+        <w:t>through</w:t>
+      </w:r>
+      <w:r>
+        <w:t xml:space="preserve"> a DM by </w:t>
+      </w:r>
+      <w:r>
+        <w:rPr>
+          <w:i/>
+          <w:iCs/>
+        </w:rPr>
+        <w:t>anyone</w:t>
+      </w:r>
+      <w:r>
+        <w:t>. It allows you to define your settings.</w:t>
+      </w:r>
+      <w:r>
+        <w:t xml:space="preserve"> They don’t need any </w:t>
+      </w:r>
+      <w:r>
+        <w:t>prefix:</w:t>
+      </w:r>
+    </w:p>
+    <w:p>
+      <w:pPr>
+        <w:pStyle w:val="Textbody"/>
+        <w:keepNext/>
+        <w:numPr>
+          <w:ilvl w:val="0"/>
+          <w:numId w:val="8"/>
+        </w:numPr>
+        <w:ind w:left="641" w:hanging="357"/>
+        <w:contextualSpacing/>
+        <w:rPr>
+          <w:color w:val="0563C1" w:themeColor="hyperlink"/>
+          <w:u w:val="single"/>
+        </w:rPr>
+      </w:pPr>
+      <w:hyperlink w:anchor="_info_-&lt;enable|disable&gt;" w:history="1">
+        <w:r>
+          <w:rPr>
+            <w:rStyle w:val="Lienhypertexte"/>
+          </w:rPr>
+          <w:t>i</w:t>
+        </w:r>
+        <w:r>
+          <w:rPr>
+            <w:rStyle w:val="Lienhypertexte"/>
+          </w:rPr>
+          <w:t>nfo</w:t>
+        </w:r>
+      </w:hyperlink>
+    </w:p>
+    <w:p>
+      <w:pPr>
+        <w:pStyle w:val="Titre3"/>
+      </w:pPr>
+      <w:bookmarkStart w:id="28" w:name="_info_-&lt;enable|disable&gt;"/>
+      <w:bookmarkEnd w:id="28"/>
+      <w:r>
+        <w:t>info -&lt;enable|disable&gt;</w:t>
+      </w:r>
+    </w:p>
+    <w:p>
+      <w:pPr>
+        <w:rPr>
+          <w:lang w:val="en-US"/>
+        </w:rPr>
+      </w:pPr>
+      <w:r>
+        <w:rPr>
+          <w:lang w:val="en-US"/>
+        </w:rPr>
+        <w:t xml:space="preserve">Allows to choose if you the bot have to send you a message when one of your </w:t>
+      </w:r>
+      <w:r>
+        <w:rPr>
+          <w:lang w:val="en-US"/>
+        </w:rPr>
+        <w:t>files</w:t>
+      </w:r>
+      <w:r>
+        <w:rPr>
+          <w:lang w:val="en-US"/>
+        </w:rPr>
+        <w:t xml:space="preserve"> is refused or validated (useful only for authors).</w:t>
+      </w:r>
+      <w:r>
+        <w:rPr>
+          <w:lang w:val="en-US"/>
+        </w:rPr>
+        <w:t xml:space="preserve"> By default they are enable</w:t>
+      </w:r>
+      <w:r>
+        <w:rPr>
+          <w:lang w:val="en-US"/>
+        </w:rPr>
+        <w:t>d</w:t>
+      </w:r>
+      <w:r>
+        <w:rPr>
+          <w:lang w:val="en-US"/>
+        </w:rPr>
+        <w:t>.</w:t>
+      </w:r>
+    </w:p>
+    <w:p>
+      <w:pPr>
+        <w:pStyle w:val="Textbody"/>
+        <w:ind w:firstLine="646"/>
+        <w:contextualSpacing/>
+      </w:pPr>
+      <w:r>
+        <w:rPr>
+          <w:b/>
+          <w:bCs/>
+        </w:rPr>
+        <w:t>-</w:t>
+      </w:r>
+      <w:r>
+        <w:rPr>
+          <w:b/>
+          <w:bCs/>
+        </w:rPr>
+        <w:t>&lt;enable|disable&gt;</w:t>
+      </w:r>
+      <w:r>
+        <w:rPr>
+          <w:b/>
+          <w:bCs/>
+        </w:rPr>
+        <w:t xml:space="preserve"> </w:t>
+      </w:r>
+      <w:r>
+        <w:t xml:space="preserve">=&gt; Indicate </w:t>
+      </w:r>
+      <w:r>
+        <w:t>‘disable’ to disable these messages else indicate ‘enable’.</w:t>
       </w:r>
     </w:p>
     <w:sectPr>

</xml_diff>

<commit_message>
Incomming message management update -> split steps -> better organisation
</commit_message>
<xml_diff>
--- a/documentation.docx
+++ b/documentation.docx
@@ -132,7 +132,21 @@
         <w:rPr>
           <w:rFonts w:asciiTheme="minorHAnsi" w:hAnsiTheme="minorHAnsi" w:cstheme="minorHAnsi"/>
         </w:rPr>
-        <w:t xml:space="preserve">, veuillez vous rendre </w:t>
+        <w:t xml:space="preserve">, </w:t>
+      </w:r>
+      <w:proofErr w:type="spellStart"/>
+      <w:r>
+        <w:rPr>
+          <w:rFonts w:asciiTheme="minorHAnsi" w:hAnsiTheme="minorHAnsi" w:cstheme="minorHAnsi"/>
+        </w:rPr>
+        <w:t>veuillez vous</w:t>
+      </w:r>
+      <w:proofErr w:type="spellEnd"/>
+      <w:r>
+        <w:rPr>
+          <w:rFonts w:asciiTheme="minorHAnsi" w:hAnsiTheme="minorHAnsi" w:cstheme="minorHAnsi"/>
+        </w:rPr>
+        <w:t xml:space="preserve"> rendre </w:t>
       </w:r>
       <w:hyperlink r:id="rId8" w:history="1">
         <w:r>
@@ -180,7 +194,33 @@
         <w:rPr>
           <w:lang w:val="fr-FR"/>
         </w:rPr>
-        <w:t xml:space="preserve"> est, comme son nom l’indique, un bot Discord destiné à gérer une bibliothèque de documents pour votre serveur. Ces documents peuvent être de n’importe quel type (images, PDF, fichiers Word, musiques, …) et sont stockés dans Google Drive, plus précisément dans un dossier de votre GDrive (ou de celui de votre serveur) que vous devrez partager au bot. </w:t>
+        <w:t xml:space="preserve"> est, comme son nom l’indique, un bot Discord destiné à gérer une bibliothèque de</w:t>
+      </w:r>
+      <w:r>
+        <w:rPr>
+          <w:lang w:val="fr-FR"/>
+        </w:rPr>
+        <w:t xml:space="preserve"> </w:t>
+      </w:r>
+      <w:r>
+        <w:rPr>
+          <w:lang w:val="fr-FR"/>
+        </w:rPr>
+        <w:t xml:space="preserve">documents pour votre serveur. Ces documents peuvent être de n’importe quel type (images, PDF, </w:t>
+      </w:r>
+      <w:proofErr w:type="gramStart"/>
+      <w:r>
+        <w:rPr>
+          <w:lang w:val="fr-FR"/>
+        </w:rPr>
+        <w:t>fichiers</w:t>
+      </w:r>
+      <w:proofErr w:type="gramEnd"/>
+      <w:r>
+        <w:rPr>
+          <w:lang w:val="fr-FR"/>
+        </w:rPr>
+        <w:t xml:space="preserve"> Word, musiques, …) et sont stockés dans Google Drive, plus précisément dans un dossier de votre GDrive (ou de celui de votre serveur) que vous devrez partager au bot. </w:t>
       </w:r>
     </w:p>
     <w:p>
@@ -1294,7 +1334,15 @@
     </w:p>
     <w:p>
       <w:r>
-        <w:t xml:space="preserve">Il ne vous reste plus qu’à envoyer le lien au bot. Pour cela, placer dans n’importe quelle salon de votre serveur Discord puis, après avoir ajouté le bot à votre serveur (en cliquant </w:t>
+        <w:t xml:space="preserve">Il ne vous reste plus qu’à envoyer le lien au bot. Pour cela, placer dans n’importe </w:t>
+      </w:r>
+      <w:proofErr w:type="gramStart"/>
+      <w:r>
+        <w:t>quelle salon</w:t>
+      </w:r>
+      <w:proofErr w:type="gramEnd"/>
+      <w:r>
+        <w:t xml:space="preserve"> de votre serveur Discord puis, après avoir ajouté le bot à votre serveur (en cliquant </w:t>
       </w:r>
       <w:hyperlink r:id="rId14" w:history="1">
         <w:r>
@@ -2646,19 +2694,7 @@
           <w:rPr>
             <w:rStyle w:val="Lienhypertexte"/>
           </w:rPr>
-          <w:t>se</w:t>
-        </w:r>
-        <w:r>
-          <w:rPr>
-            <w:rStyle w:val="Lienhypertexte"/>
-          </w:rPr>
-          <w:t>n</w:t>
-        </w:r>
-        <w:r>
-          <w:rPr>
-            <w:rStyle w:val="Lienhypertexte"/>
-          </w:rPr>
-          <w:t>d</w:t>
+          <w:t>send</w:t>
         </w:r>
       </w:hyperlink>
     </w:p>
@@ -2680,31 +2716,7 @@
           <w:rPr>
             <w:rStyle w:val="Lienhypertexte"/>
           </w:rPr>
-          <w:t>search_un</w:t>
-        </w:r>
-        <w:r>
-          <w:rPr>
-            <w:rStyle w:val="Lienhypertexte"/>
-          </w:rPr>
-          <w:t>v</w:t>
-        </w:r>
-        <w:r>
-          <w:rPr>
-            <w:rStyle w:val="Lienhypertexte"/>
-          </w:rPr>
-          <w:t>a</w:t>
-        </w:r>
-        <w:r>
-          <w:rPr>
-            <w:rStyle w:val="Lienhypertexte"/>
-          </w:rPr>
-          <w:t>l</w:t>
-        </w:r>
-        <w:r>
-          <w:rPr>
-            <w:rStyle w:val="Lienhypertexte"/>
-          </w:rPr>
-          <w:t>idate</w:t>
+          <w:t>search_unvalidate</w:t>
         </w:r>
       </w:hyperlink>
     </w:p>
@@ -2734,49 +2746,7 @@
         <w:rPr>
           <w:rStyle w:val="Lienhypertexte"/>
         </w:rPr>
-        <w:t>get</w:t>
-      </w:r>
-      <w:r>
-        <w:rPr>
-          <w:rStyle w:val="Lienhypertexte"/>
-        </w:rPr>
-        <w:t>_</w:t>
-      </w:r>
-      <w:r>
-        <w:rPr>
-          <w:rStyle w:val="Lienhypertexte"/>
-        </w:rPr>
-        <w:t>u</w:t>
-      </w:r>
-      <w:r>
-        <w:rPr>
-          <w:rStyle w:val="Lienhypertexte"/>
-        </w:rPr>
-        <w:t>n</w:t>
-      </w:r>
-      <w:r>
-        <w:rPr>
-          <w:rStyle w:val="Lienhypertexte"/>
-        </w:rPr>
-        <w:t>v</w:t>
-      </w:r>
-      <w:r>
-        <w:rPr>
-          <w:rStyle w:val="Lienhypertexte"/>
-        </w:rPr>
-        <w:t>alid</w:t>
-      </w:r>
-      <w:r>
-        <w:rPr>
-          <w:rStyle w:val="Lienhypertexte"/>
-        </w:rPr>
-        <w:t>a</w:t>
-      </w:r>
-      <w:r>
-        <w:rPr>
-          <w:rStyle w:val="Lienhypertexte"/>
-        </w:rPr>
-        <w:t>te</w:t>
+        <w:t>get_unvalidate</w:t>
       </w:r>
     </w:p>
     <w:p>
@@ -2800,19 +2770,7 @@
           <w:rPr>
             <w:rStyle w:val="Lienhypertexte"/>
           </w:rPr>
-          <w:t>v</w:t>
-        </w:r>
-        <w:r>
-          <w:rPr>
-            <w:rStyle w:val="Lienhypertexte"/>
-          </w:rPr>
-          <w:t>a</w:t>
-        </w:r>
-        <w:r>
-          <w:rPr>
-            <w:rStyle w:val="Lienhypertexte"/>
-          </w:rPr>
-          <w:t>lidate</w:t>
+          <w:t>validate</w:t>
         </w:r>
       </w:hyperlink>
     </w:p>
@@ -2834,19 +2792,7 @@
           <w:rPr>
             <w:rStyle w:val="Lienhypertexte"/>
           </w:rPr>
-          <w:t>refu</w:t>
-        </w:r>
-        <w:r>
-          <w:rPr>
-            <w:rStyle w:val="Lienhypertexte"/>
-          </w:rPr>
-          <w:t>s</w:t>
-        </w:r>
-        <w:r>
-          <w:rPr>
-            <w:rStyle w:val="Lienhypertexte"/>
-          </w:rPr>
-          <w:t>e</w:t>
+          <w:t>refuse</w:t>
         </w:r>
       </w:hyperlink>
     </w:p>
@@ -2868,13 +2814,7 @@
           <w:rPr>
             <w:rStyle w:val="Lienhypertexte"/>
           </w:rPr>
-          <w:t>updat</w:t>
-        </w:r>
-        <w:r>
-          <w:rPr>
-            <w:rStyle w:val="Lienhypertexte"/>
-          </w:rPr>
-          <w:t>e</w:t>
+          <w:t>update</w:t>
         </w:r>
       </w:hyperlink>
     </w:p>
@@ -2896,19 +2836,7 @@
           <w:rPr>
             <w:rStyle w:val="Lienhypertexte"/>
           </w:rPr>
-          <w:t>dele</w:t>
-        </w:r>
-        <w:r>
-          <w:rPr>
-            <w:rStyle w:val="Lienhypertexte"/>
-          </w:rPr>
-          <w:t>t</w:t>
-        </w:r>
-        <w:r>
-          <w:rPr>
-            <w:rStyle w:val="Lienhypertexte"/>
-          </w:rPr>
-          <w:t>e</w:t>
+          <w:t>delete</w:t>
         </w:r>
       </w:hyperlink>
     </w:p>
@@ -3105,12 +3033,14 @@
       <w:r>
         <w:t xml:space="preserve"> </w:t>
       </w:r>
+      <w:proofErr w:type="spellStart"/>
       <w:r>
         <w:rPr>
           <w:rFonts w:ascii="Courier New" w:hAnsi="Courier New" w:cs="Courier New"/>
         </w:rPr>
         <w:t>sd</w:t>
       </w:r>
+      <w:proofErr w:type="spellEnd"/>
     </w:p>
     <w:p>
       <w:pPr>
@@ -3147,243 +3077,6 @@
       </w:r>
       <w:r>
         <w:t xml:space="preserve">(guide </w:t>
-      </w:r>
-      <w:hyperlink w:anchor="_Envoyer_un_fichier" w:history="1">
-        <w:r>
-          <w:rPr>
-            <w:rStyle w:val="Lienhypertexte"/>
-          </w:rPr>
-          <w:t>he</w:t>
-        </w:r>
-        <w:r>
-          <w:rPr>
-            <w:rStyle w:val="Lienhypertexte"/>
-          </w:rPr>
-          <w:t>r</w:t>
-        </w:r>
-        <w:r>
-          <w:rPr>
-            <w:rStyle w:val="Lienhypertexte"/>
-          </w:rPr>
-          <w:t>e</w:t>
-        </w:r>
-      </w:hyperlink>
-      <w:r>
-        <w:t>).</w:t>
-      </w:r>
-    </w:p>
-    <w:p>
-      <w:pPr>
-        <w:pStyle w:val="Textbody"/>
-        <w:ind w:firstLine="709"/>
-        <w:contextualSpacing/>
-        <w:rPr>
-          <w:color w:val="000000"/>
-        </w:rPr>
-      </w:pPr>
-      <w:r>
-        <w:rPr>
-          <w:color w:val="000000"/>
-        </w:rPr>
-        <w:t>-</w:t>
-      </w:r>
-      <w:r>
-        <w:rPr>
-          <w:b/>
-          <w:bCs/>
-          <w:color w:val="000000"/>
-        </w:rPr>
-        <w:t>subject</w:t>
-      </w:r>
-      <w:r>
-        <w:rPr>
-          <w:color w:val="000000"/>
-        </w:rPr>
-        <w:t xml:space="preserve">: </w:t>
-      </w:r>
-      <w:r>
-        <w:rPr>
-          <w:b/>
-          <w:bCs/>
-          <w:color w:val="000000"/>
-        </w:rPr>
-        <w:t xml:space="preserve">&lt;subject&gt; </w:t>
-      </w:r>
-      <w:r>
-        <w:rPr>
-          <w:color w:val="000000"/>
-        </w:rPr>
-        <w:t>=&gt; Indicate the documents’ subject that you want to see;</w:t>
-      </w:r>
-    </w:p>
-    <w:p>
-      <w:pPr>
-        <w:pStyle w:val="Textbody"/>
-        <w:contextualSpacing/>
-        <w:rPr>
-          <w:rFonts w:ascii="Courier New" w:hAnsi="Courier New" w:cs="Courier New"/>
-        </w:rPr>
-      </w:pPr>
-      <w:r>
-        <w:rPr>
-          <w:i/>
-          <w:iCs/>
-        </w:rPr>
-        <w:t>Short version:</w:t>
-      </w:r>
-      <w:r>
-        <w:t xml:space="preserve"> </w:t>
-      </w:r>
-      <w:r>
-        <w:rPr>
-          <w:rFonts w:ascii="Courier New" w:hAnsi="Courier New" w:cs="Courier New"/>
-        </w:rPr>
-        <w:t>s</w:t>
-      </w:r>
-      <w:r>
-        <w:rPr>
-          <w:rFonts w:ascii="Courier New" w:hAnsi="Courier New" w:cs="Courier New"/>
-        </w:rPr>
-        <w:t>u</w:t>
-      </w:r>
-    </w:p>
-    <w:p>
-      <w:pPr>
-        <w:pStyle w:val="Titre3"/>
-      </w:pPr>
-      <w:bookmarkStart w:id="14" w:name="_get_unvalidate_-id:&lt;document’s_id&gt;"/>
-      <w:bookmarkEnd w:id="14"/>
-      <w:r>
-        <w:t>g</w:t>
-      </w:r>
-      <w:r>
-        <w:t>et</w:t>
-      </w:r>
-      <w:r>
-        <w:t>_unvalidate</w:t>
-      </w:r>
-      <w:r>
-        <w:t xml:space="preserve"> -</w:t>
-      </w:r>
-      <w:r>
-        <w:t>id:&lt;</w:t>
-      </w:r>
-      <w:r>
-        <w:t>document’s id</w:t>
-      </w:r>
-      <w:r>
-        <w:t>&gt;</w:t>
-      </w:r>
-    </w:p>
-    <w:p>
-      <w:pPr>
-        <w:pStyle w:val="Textbody"/>
-        <w:keepNext/>
-        <w:keepLines/>
-        <w:contextualSpacing/>
-      </w:pPr>
-      <w:r>
-        <w:t>Allows you to get the content of a file</w:t>
-      </w:r>
-      <w:r>
-        <w:t xml:space="preserve"> which wait for a validation or which has been refused</w:t>
-      </w:r>
-      <w:r>
-        <w:t xml:space="preserve"> (guide </w:t>
-      </w:r>
-      <w:hyperlink w:anchor="_Envoyer_un_fichier" w:history="1">
-        <w:r>
-          <w:rPr>
-            <w:rStyle w:val="Lienhypertexte"/>
-          </w:rPr>
-          <w:t>h</w:t>
-        </w:r>
-        <w:r>
-          <w:rPr>
-            <w:rStyle w:val="Lienhypertexte"/>
-          </w:rPr>
-          <w:t>e</w:t>
-        </w:r>
-        <w:r>
-          <w:rPr>
-            <w:rStyle w:val="Lienhypertexte"/>
-          </w:rPr>
-          <w:t>re</w:t>
-        </w:r>
-      </w:hyperlink>
-      <w:r>
-        <w:t>).</w:t>
-      </w:r>
-    </w:p>
-    <w:p>
-      <w:pPr>
-        <w:pStyle w:val="Textbody"/>
-        <w:keepNext/>
-        <w:keepLines/>
-        <w:ind w:firstLine="646"/>
-        <w:contextualSpacing/>
-      </w:pPr>
-      <w:r>
-        <w:rPr>
-          <w:b/>
-          <w:bCs/>
-        </w:rPr>
-        <w:t xml:space="preserve">-id: &lt;document’s id&gt; </w:t>
-      </w:r>
-      <w:r>
-        <w:t xml:space="preserve">=&gt; Indicate </w:t>
-      </w:r>
-      <w:r>
-        <w:t>the</w:t>
-      </w:r>
-      <w:r>
-        <w:t xml:space="preserve"> document’s ID.</w:t>
-      </w:r>
-    </w:p>
-    <w:p>
-      <w:pPr>
-        <w:pStyle w:val="Textbody"/>
-        <w:contextualSpacing/>
-      </w:pPr>
-      <w:r>
-        <w:rPr>
-          <w:i/>
-          <w:iCs/>
-        </w:rPr>
-        <w:t>Short version:</w:t>
-      </w:r>
-      <w:r>
-        <w:t xml:space="preserve"> </w:t>
-      </w:r>
-      <w:r>
-        <w:rPr>
-          <w:rFonts w:ascii="Courier New" w:hAnsi="Courier New" w:cs="Courier New"/>
-        </w:rPr>
-        <w:t>gu</w:t>
-      </w:r>
-    </w:p>
-    <w:p>
-      <w:pPr>
-        <w:pStyle w:val="Titre3"/>
-      </w:pPr>
-      <w:bookmarkStart w:id="15" w:name="_validate_-id:&lt;document’s_id&gt;"/>
-      <w:bookmarkEnd w:id="15"/>
-      <w:r>
-        <w:tab/>
-      </w:r>
-      <w:r>
-        <w:t>validate -id:&lt;document’s id&gt;</w:t>
-      </w:r>
-    </w:p>
-    <w:p>
-      <w:pPr>
-        <w:pStyle w:val="Textbody"/>
-        <w:keepNext/>
-        <w:keepLines/>
-        <w:contextualSpacing/>
-      </w:pPr>
-      <w:r>
-        <w:t xml:space="preserve">Allows you to validate a document if it isn’t already refused (guide </w:t>
       </w:r>
       <w:hyperlink w:anchor="_Envoyer_un_fichier" w:history="1">
         <w:r>
@@ -3400,6 +3093,223 @@
     <w:p>
       <w:pPr>
         <w:pStyle w:val="Textbody"/>
+        <w:ind w:firstLine="709"/>
+        <w:contextualSpacing/>
+        <w:rPr>
+          <w:color w:val="000000"/>
+        </w:rPr>
+      </w:pPr>
+      <w:r>
+        <w:rPr>
+          <w:color w:val="000000"/>
+        </w:rPr>
+        <w:t>-</w:t>
+      </w:r>
+      <w:r>
+        <w:rPr>
+          <w:b/>
+          <w:bCs/>
+          <w:color w:val="000000"/>
+        </w:rPr>
+        <w:t>subject</w:t>
+      </w:r>
+      <w:r>
+        <w:rPr>
+          <w:color w:val="000000"/>
+        </w:rPr>
+        <w:t xml:space="preserve">: </w:t>
+      </w:r>
+      <w:r>
+        <w:rPr>
+          <w:b/>
+          <w:bCs/>
+          <w:color w:val="000000"/>
+        </w:rPr>
+        <w:t xml:space="preserve">&lt;subject&gt; </w:t>
+      </w:r>
+      <w:r>
+        <w:rPr>
+          <w:color w:val="000000"/>
+        </w:rPr>
+        <w:t>=&gt; Indicate the documents’ subject that you want to see;</w:t>
+      </w:r>
+    </w:p>
+    <w:p>
+      <w:pPr>
+        <w:pStyle w:val="Textbody"/>
+        <w:contextualSpacing/>
+        <w:rPr>
+          <w:rFonts w:ascii="Courier New" w:hAnsi="Courier New" w:cs="Courier New"/>
+        </w:rPr>
+      </w:pPr>
+      <w:r>
+        <w:rPr>
+          <w:i/>
+          <w:iCs/>
+        </w:rPr>
+        <w:t>Short version:</w:t>
+      </w:r>
+      <w:r>
+        <w:t xml:space="preserve"> </w:t>
+      </w:r>
+      <w:proofErr w:type="spellStart"/>
+      <w:r>
+        <w:rPr>
+          <w:rFonts w:ascii="Courier New" w:hAnsi="Courier New" w:cs="Courier New"/>
+        </w:rPr>
+        <w:t>s</w:t>
+      </w:r>
+      <w:r>
+        <w:rPr>
+          <w:rFonts w:ascii="Courier New" w:hAnsi="Courier New" w:cs="Courier New"/>
+        </w:rPr>
+        <w:t>u</w:t>
+      </w:r>
+      <w:proofErr w:type="spellEnd"/>
+    </w:p>
+    <w:p>
+      <w:pPr>
+        <w:pStyle w:val="Titre3"/>
+      </w:pPr>
+      <w:bookmarkStart w:id="14" w:name="_get_unvalidate_-id:&lt;document’s_id&gt;"/>
+      <w:bookmarkEnd w:id="14"/>
+      <w:r>
+        <w:t>g</w:t>
+      </w:r>
+      <w:r>
+        <w:t>et</w:t>
+      </w:r>
+      <w:r>
+        <w:t>_unvalidate</w:t>
+      </w:r>
+      <w:r>
+        <w:t xml:space="preserve"> -</w:t>
+      </w:r>
+      <w:r>
+        <w:t>id:&lt;</w:t>
+      </w:r>
+      <w:r>
+        <w:t>document’s id</w:t>
+      </w:r>
+      <w:r>
+        <w:t>&gt;</w:t>
+      </w:r>
+    </w:p>
+    <w:p>
+      <w:pPr>
+        <w:pStyle w:val="Textbody"/>
+        <w:keepNext/>
+        <w:keepLines/>
+        <w:contextualSpacing/>
+      </w:pPr>
+      <w:r>
+        <w:t>Allows you to get the content of a file</w:t>
+      </w:r>
+      <w:r>
+        <w:t xml:space="preserve"> which wait for a validation or which has been refused</w:t>
+      </w:r>
+      <w:r>
+        <w:t xml:space="preserve"> (guide </w:t>
+      </w:r>
+      <w:hyperlink w:anchor="_Envoyer_un_fichier" w:history="1">
+        <w:r>
+          <w:rPr>
+            <w:rStyle w:val="Lienhypertexte"/>
+          </w:rPr>
+          <w:t>here</w:t>
+        </w:r>
+      </w:hyperlink>
+      <w:r>
+        <w:t>).</w:t>
+      </w:r>
+    </w:p>
+    <w:p>
+      <w:pPr>
+        <w:pStyle w:val="Textbody"/>
+        <w:keepNext/>
+        <w:keepLines/>
+        <w:ind w:firstLine="646"/>
+        <w:contextualSpacing/>
+      </w:pPr>
+      <w:r>
+        <w:rPr>
+          <w:b/>
+          <w:bCs/>
+        </w:rPr>
+        <w:t xml:space="preserve">-id: &lt;document’s id&gt; </w:t>
+      </w:r>
+      <w:r>
+        <w:t xml:space="preserve">=&gt; Indicate </w:t>
+      </w:r>
+      <w:r>
+        <w:t>the</w:t>
+      </w:r>
+      <w:r>
+        <w:t xml:space="preserve"> document’s ID.</w:t>
+      </w:r>
+    </w:p>
+    <w:p>
+      <w:pPr>
+        <w:pStyle w:val="Textbody"/>
+        <w:contextualSpacing/>
+      </w:pPr>
+      <w:r>
+        <w:rPr>
+          <w:i/>
+          <w:iCs/>
+        </w:rPr>
+        <w:t>Short version:</w:t>
+      </w:r>
+      <w:r>
+        <w:t xml:space="preserve"> </w:t>
+      </w:r>
+      <w:proofErr w:type="spellStart"/>
+      <w:r>
+        <w:rPr>
+          <w:rFonts w:ascii="Courier New" w:hAnsi="Courier New" w:cs="Courier New"/>
+        </w:rPr>
+        <w:t>gu</w:t>
+      </w:r>
+      <w:proofErr w:type="spellEnd"/>
+    </w:p>
+    <w:p>
+      <w:pPr>
+        <w:pStyle w:val="Titre3"/>
+      </w:pPr>
+      <w:bookmarkStart w:id="15" w:name="_validate_-id:&lt;document’s_id&gt;"/>
+      <w:bookmarkEnd w:id="15"/>
+      <w:r>
+        <w:tab/>
+      </w:r>
+      <w:r>
+        <w:t>validate -id:&lt;document’s id&gt;</w:t>
+      </w:r>
+    </w:p>
+    <w:p>
+      <w:pPr>
+        <w:pStyle w:val="Textbody"/>
+        <w:keepNext/>
+        <w:keepLines/>
+        <w:contextualSpacing/>
+      </w:pPr>
+      <w:r>
+        <w:t xml:space="preserve">Allows you to validate a document if it isn’t already refused (guide </w:t>
+      </w:r>
+      <w:hyperlink w:anchor="_Envoyer_un_fichier" w:history="1">
+        <w:r>
+          <w:rPr>
+            <w:rStyle w:val="Lienhypertexte"/>
+          </w:rPr>
+          <w:t>here</w:t>
+        </w:r>
+      </w:hyperlink>
+      <w:r>
+        <w:t>).</w:t>
+      </w:r>
+    </w:p>
+    <w:p>
+      <w:pPr>
+        <w:pStyle w:val="Textbody"/>
         <w:keepNext/>
         <w:keepLines/>
         <w:ind w:firstLine="709"/>
@@ -4287,16 +4197,29 @@
         <w:t>[</w:t>
       </w:r>
       <w:r>
-        <w:t>-subject:&lt;subject</w:t>
+        <w:t>-subject:&lt;</w:t>
+      </w:r>
+      <w:proofErr w:type="spellStart"/>
+      <w:r>
+        <w:t>subject</w:t>
       </w:r>
       <w:r>
         <w:t>_name</w:t>
       </w:r>
+      <w:proofErr w:type="spellEnd"/>
       <w:r>
         <w:t>&gt;</w:t>
       </w:r>
       <w:r>
-        <w:t>] [-level:&lt;level_name&gt;] - @&lt;Role&gt; [#&lt;Channel&gt;</w:t>
+        <w:t>] [-level:&lt;</w:t>
+      </w:r>
+      <w:proofErr w:type="spellStart"/>
+      <w:r>
+        <w:t>level_name</w:t>
+      </w:r>
+      <w:proofErr w:type="spellEnd"/>
+      <w:r>
+        <w:t>&gt;] - @&lt;Role&gt; [#&lt;Channel&gt;</w:t>
       </w:r>
     </w:p>
     <w:p>
@@ -4368,7 +4291,23 @@
           <w:b/>
           <w:bCs/>
         </w:rPr>
-        <w:t xml:space="preserve">-subject: &lt;subject_name&gt; </w:t>
+        <w:t>-subject: &lt;</w:t>
+      </w:r>
+      <w:proofErr w:type="spellStart"/>
+      <w:r>
+        <w:rPr>
+          <w:b/>
+          <w:bCs/>
+        </w:rPr>
+        <w:t>subject_name</w:t>
+      </w:r>
+      <w:proofErr w:type="spellEnd"/>
+      <w:r>
+        <w:rPr>
+          <w:b/>
+          <w:bCs/>
+        </w:rPr>
+        <w:t xml:space="preserve">&gt; </w:t>
       </w:r>
       <w:r>
         <w:t>=&gt; Use it just if you want to create a subject. Indicate the subject’s name.</w:t>
@@ -4388,7 +4327,23 @@
           <w:b/>
           <w:bCs/>
         </w:rPr>
-        <w:t xml:space="preserve">-level: &lt;level_name&gt; </w:t>
+        <w:t>-level: &lt;</w:t>
+      </w:r>
+      <w:proofErr w:type="spellStart"/>
+      <w:r>
+        <w:rPr>
+          <w:b/>
+          <w:bCs/>
+        </w:rPr>
+        <w:t>level_name</w:t>
+      </w:r>
+      <w:proofErr w:type="spellEnd"/>
+      <w:r>
+        <w:rPr>
+          <w:b/>
+          <w:bCs/>
+        </w:rPr>
+        <w:t xml:space="preserve">&gt; </w:t>
       </w:r>
       <w:r>
         <w:t>=&gt; Use it just if you want to create a level. Indicate the level’s name.</w:t>
@@ -4460,16 +4415,29 @@
         <w:t>modify_settings</w:t>
       </w:r>
       <w:r>
-        <w:t xml:space="preserve"> -subject:&lt;subject</w:t>
+        <w:t xml:space="preserve"> -subject:&lt;</w:t>
+      </w:r>
+      <w:proofErr w:type="spellStart"/>
+      <w:r>
+        <w:t>subject</w:t>
       </w:r>
       <w:r>
         <w:t>_name</w:t>
       </w:r>
+      <w:proofErr w:type="spellEnd"/>
       <w:r>
         <w:t>&gt;</w:t>
       </w:r>
       <w:r>
-        <w:t xml:space="preserve"> [-name:&lt;new_name] – [@&lt;Role&gt;] [#&lt;Channel&gt;</w:t>
+        <w:t xml:space="preserve"> [-name:&lt;</w:t>
+      </w:r>
+      <w:proofErr w:type="spellStart"/>
+      <w:r>
+        <w:t>new_name</w:t>
+      </w:r>
+      <w:proofErr w:type="spellEnd"/>
+      <w:r>
+        <w:t>] – [@&lt;Role&gt;] [#&lt;Channel&gt;</w:t>
       </w:r>
     </w:p>
     <w:p>
@@ -4490,7 +4458,21 @@
         <w:rPr>
           <w:color w:val="000000"/>
         </w:rPr>
-        <w:t xml:space="preserve">to modify subject’s name or bindings : channels and role  (more information </w:t>
+        <w:t xml:space="preserve">to modify subject’s name or </w:t>
+      </w:r>
+      <w:proofErr w:type="gramStart"/>
+      <w:r>
+        <w:rPr>
+          <w:color w:val="000000"/>
+        </w:rPr>
+        <w:t>bindings :</w:t>
+      </w:r>
+      <w:proofErr w:type="gramEnd"/>
+      <w:r>
+        <w:rPr>
+          <w:color w:val="000000"/>
+        </w:rPr>
+        <w:t xml:space="preserve"> channels and role  (more information </w:t>
       </w:r>
       <w:hyperlink w:anchor="_Domaines,_niveaux_et" w:history="1">
         <w:r>
@@ -4532,7 +4514,23 @@
           <w:b/>
           <w:bCs/>
         </w:rPr>
-        <w:t xml:space="preserve">-subject: &lt;subject_name&gt; </w:t>
+        <w:t>-subject: &lt;</w:t>
+      </w:r>
+      <w:proofErr w:type="spellStart"/>
+      <w:r>
+        <w:rPr>
+          <w:b/>
+          <w:bCs/>
+        </w:rPr>
+        <w:t>subject_name</w:t>
+      </w:r>
+      <w:proofErr w:type="spellEnd"/>
+      <w:r>
+        <w:rPr>
+          <w:b/>
+          <w:bCs/>
+        </w:rPr>
+        <w:t xml:space="preserve">&gt; </w:t>
       </w:r>
       <w:r>
         <w:t>=&gt; Indicate the actual subject’s name you want to modify.</w:t>
@@ -4617,7 +4615,15 @@
         <w:t xml:space="preserve">- #&lt;Channel&gt; </w:t>
       </w:r>
       <w:r>
-        <w:t>=&gt; Indicate an existing TextChannel, it will be added to the channels’ list of this subject if it’s not already in the list, else it will be deleted from the list.</w:t>
+        <w:t xml:space="preserve">=&gt; Indicate an existing </w:t>
+      </w:r>
+      <w:proofErr w:type="spellStart"/>
+      <w:r>
+        <w:t>TextChannel</w:t>
+      </w:r>
+      <w:proofErr w:type="spellEnd"/>
+      <w:r>
+        <w:t>, it will be added to the channels’ list of this subject if it’s not already in the list, else it will be deleted from the list.</w:t>
       </w:r>
     </w:p>
     <w:p>
@@ -4635,11 +4641,19 @@
       <w:r>
         <w:t xml:space="preserve"> </w:t>
       </w:r>
+      <w:proofErr w:type="spellStart"/>
       <w:r>
         <w:rPr>
           <w:rFonts w:ascii="Courier New" w:hAnsi="Courier New" w:cs="Courier New"/>
         </w:rPr>
-        <w:t>ms -subject</w:t>
+        <w:t>ms</w:t>
+      </w:r>
+      <w:proofErr w:type="spellEnd"/>
+      <w:r>
+        <w:rPr>
+          <w:rFonts w:ascii="Courier New" w:hAnsi="Courier New" w:cs="Courier New"/>
+        </w:rPr>
+        <w:t xml:space="preserve"> -subject</w:t>
       </w:r>
     </w:p>
     <w:p>
@@ -4660,14 +4674,24 @@
       <w:r>
         <w:t>:&lt;</w:t>
       </w:r>
+      <w:proofErr w:type="spellStart"/>
       <w:r>
         <w:t>level_name</w:t>
       </w:r>
+      <w:proofErr w:type="spellEnd"/>
       <w:r>
         <w:t>&gt;</w:t>
       </w:r>
       <w:r>
-        <w:t xml:space="preserve"> [-name:&lt;new_name] – [@&lt;Role&gt;]</w:t>
+        <w:t xml:space="preserve"> [-name:&lt;</w:t>
+      </w:r>
+      <w:proofErr w:type="spellStart"/>
+      <w:r>
+        <w:t>new_name</w:t>
+      </w:r>
+      <w:proofErr w:type="spellEnd"/>
+      <w:r>
+        <w:t>] – [@&lt;Role&gt;]</w:t>
       </w:r>
     </w:p>
     <w:p>
@@ -4688,7 +4712,31 @@
         <w:rPr>
           <w:color w:val="000000"/>
         </w:rPr>
-        <w:t xml:space="preserve">to modify level’s name or bindings : channels and role  (more information </w:t>
+        <w:t xml:space="preserve">to modify level’s name or </w:t>
+      </w:r>
+      <w:r>
+        <w:rPr>
+          <w:color w:val="000000"/>
+        </w:rPr>
+        <w:t>bindings:</w:t>
+      </w:r>
+      <w:r>
+        <w:rPr>
+          <w:color w:val="000000"/>
+        </w:rPr>
+        <w:t xml:space="preserve"> channels and </w:t>
+      </w:r>
+      <w:r>
+        <w:rPr>
+          <w:color w:val="000000"/>
+        </w:rPr>
+        <w:t>role (</w:t>
+      </w:r>
+      <w:r>
+        <w:rPr>
+          <w:color w:val="000000"/>
+        </w:rPr>
+        <w:t xml:space="preserve">more information </w:t>
       </w:r>
       <w:hyperlink w:anchor="_Domaines,_niveaux_et" w:history="1">
         <w:r>
@@ -4716,7 +4764,23 @@
           <w:b/>
           <w:bCs/>
         </w:rPr>
-        <w:t xml:space="preserve">-subject: &lt;level_name&gt; </w:t>
+        <w:t>-subject: &lt;</w:t>
+      </w:r>
+      <w:proofErr w:type="spellStart"/>
+      <w:r>
+        <w:rPr>
+          <w:b/>
+          <w:bCs/>
+        </w:rPr>
+        <w:t>level_name</w:t>
+      </w:r>
+      <w:proofErr w:type="spellEnd"/>
+      <w:r>
+        <w:rPr>
+          <w:b/>
+          <w:bCs/>
+        </w:rPr>
+        <w:t xml:space="preserve">&gt; </w:t>
       </w:r>
       <w:r>
         <w:t>=&gt; Indicate the actual level’s name you want to modify.</w:t>
@@ -4736,7 +4800,23 @@
           <w:b/>
           <w:bCs/>
         </w:rPr>
-        <w:t xml:space="preserve">-name: &lt;new_name&gt; </w:t>
+        <w:t>-name: &lt;</w:t>
+      </w:r>
+      <w:proofErr w:type="spellStart"/>
+      <w:r>
+        <w:rPr>
+          <w:b/>
+          <w:bCs/>
+        </w:rPr>
+        <w:t>new_name</w:t>
+      </w:r>
+      <w:proofErr w:type="spellEnd"/>
+      <w:r>
+        <w:rPr>
+          <w:b/>
+          <w:bCs/>
+        </w:rPr>
+        <w:t xml:space="preserve">&gt; </w:t>
       </w:r>
       <w:r>
         <w:t>=&gt; Indicate the new name of the level.</w:t>
@@ -4774,11 +4854,19 @@
       <w:r>
         <w:t xml:space="preserve"> </w:t>
       </w:r>
+      <w:proofErr w:type="spellStart"/>
       <w:r>
         <w:rPr>
           <w:rFonts w:ascii="Courier New" w:hAnsi="Courier New" w:cs="Courier New"/>
         </w:rPr>
-        <w:t>ms -level</w:t>
+        <w:t>ms</w:t>
+      </w:r>
+      <w:proofErr w:type="spellEnd"/>
+      <w:r>
+        <w:rPr>
+          <w:rFonts w:ascii="Courier New" w:hAnsi="Courier New" w:cs="Courier New"/>
+        </w:rPr>
+        <w:t xml:space="preserve"> -level</w:t>
       </w:r>
     </w:p>
     <w:p>
@@ -4874,7 +4962,15 @@
         <w:t xml:space="preserve">- #&lt;Channel&gt; </w:t>
       </w:r>
       <w:r>
-        <w:t>=&gt; Indicate an existing TextChannel, it will be added to the channels’ list of this subject if it’s not already in the list, else it will be deleted from the list.</w:t>
+        <w:t xml:space="preserve">=&gt; Indicate an existing </w:t>
+      </w:r>
+      <w:proofErr w:type="spellStart"/>
+      <w:r>
+        <w:t>TextChannel</w:t>
+      </w:r>
+      <w:proofErr w:type="spellEnd"/>
+      <w:r>
+        <w:t>, it will be added to the channels’ list of this subject if it’s not already in the list, else it will be deleted from the list.</w:t>
       </w:r>
     </w:p>
     <w:p>
@@ -4892,12 +4988,28 @@
       <w:r>
         <w:t xml:space="preserve"> </w:t>
       </w:r>
+      <w:proofErr w:type="spellStart"/>
       <w:r>
         <w:rPr>
           <w:rFonts w:ascii="Courier New" w:hAnsi="Courier New" w:cs="Courier New"/>
         </w:rPr>
-        <w:t>ms -gobalc</w:t>
-      </w:r>
+        <w:t>ms</w:t>
+      </w:r>
+      <w:proofErr w:type="spellEnd"/>
+      <w:r>
+        <w:rPr>
+          <w:rFonts w:ascii="Courier New" w:hAnsi="Courier New" w:cs="Courier New"/>
+        </w:rPr>
+        <w:t xml:space="preserve"> -</w:t>
+      </w:r>
+      <w:proofErr w:type="spellStart"/>
+      <w:r>
+        <w:rPr>
+          <w:rFonts w:ascii="Courier New" w:hAnsi="Courier New" w:cs="Courier New"/>
+        </w:rPr>
+        <w:t>gobalc</w:t>
+      </w:r>
+      <w:proofErr w:type="spellEnd"/>
     </w:p>
     <w:p>
       <w:pPr>
@@ -4912,7 +5024,15 @@
         <w:t xml:space="preserve"> -</w:t>
       </w:r>
       <w:r>
-        <w:t>validation:&lt;true|false&gt;</w:t>
+        <w:t>validation:&lt;</w:t>
+      </w:r>
+      <w:proofErr w:type="spellStart"/>
+      <w:r>
+        <w:t>true|false</w:t>
+      </w:r>
+      <w:proofErr w:type="spellEnd"/>
+      <w:r>
+        <w:t>&gt;</w:t>
       </w:r>
     </w:p>
     <w:p>
@@ -4972,7 +5092,23 @@
           <w:b/>
           <w:bCs/>
         </w:rPr>
-        <w:t xml:space="preserve">-validation: &lt;true|false&gt; </w:t>
+        <w:t>-validation: &lt;</w:t>
+      </w:r>
+      <w:proofErr w:type="spellStart"/>
+      <w:r>
+        <w:rPr>
+          <w:b/>
+          <w:bCs/>
+        </w:rPr>
+        <w:t>true|false</w:t>
+      </w:r>
+      <w:proofErr w:type="spellEnd"/>
+      <w:r>
+        <w:rPr>
+          <w:b/>
+          <w:bCs/>
+        </w:rPr>
+        <w:t xml:space="preserve">&gt; </w:t>
       </w:r>
       <w:r>
         <w:t>=&gt; Indicate ‘true’ (enable) or ‘false’(disable).</w:t>
@@ -4993,11 +5129,19 @@
       <w:r>
         <w:t xml:space="preserve"> </w:t>
       </w:r>
+      <w:proofErr w:type="spellStart"/>
       <w:r>
         <w:rPr>
           <w:rFonts w:ascii="Courier New" w:hAnsi="Courier New" w:cs="Courier New"/>
         </w:rPr>
-        <w:t>ms -validation</w:t>
+        <w:t>ms</w:t>
+      </w:r>
+      <w:proofErr w:type="spellEnd"/>
+      <w:r>
+        <w:rPr>
+          <w:rFonts w:ascii="Courier New" w:hAnsi="Courier New" w:cs="Courier New"/>
+        </w:rPr>
+        <w:t xml:space="preserve"> -validation</w:t>
       </w:r>
     </w:p>
     <w:p>
@@ -5011,7 +5155,15 @@
         <w:t xml:space="preserve"> -</w:t>
       </w:r>
       <w:r>
-        <w:t>refuse:&lt;true|false&gt;</w:t>
+        <w:t>refuse:&lt;</w:t>
+      </w:r>
+      <w:proofErr w:type="spellStart"/>
+      <w:r>
+        <w:t>true|false</w:t>
+      </w:r>
+      <w:proofErr w:type="spellEnd"/>
+      <w:r>
+        <w:t>&gt;</w:t>
       </w:r>
     </w:p>
     <w:p>
@@ -5071,7 +5223,23 @@
           <w:b/>
           <w:bCs/>
         </w:rPr>
-        <w:t xml:space="preserve">-validation: &lt;true|false&gt; </w:t>
+        <w:t>-validation: &lt;</w:t>
+      </w:r>
+      <w:proofErr w:type="spellStart"/>
+      <w:r>
+        <w:rPr>
+          <w:b/>
+          <w:bCs/>
+        </w:rPr>
+        <w:t>true|false</w:t>
+      </w:r>
+      <w:proofErr w:type="spellEnd"/>
+      <w:r>
+        <w:rPr>
+          <w:b/>
+          <w:bCs/>
+        </w:rPr>
+        <w:t xml:space="preserve">&gt; </w:t>
       </w:r>
       <w:r>
         <w:t>=&gt; Indicate ‘true’ (enable) or ‘false’(disable).</w:t>
@@ -5092,11 +5260,19 @@
       <w:r>
         <w:t xml:space="preserve"> </w:t>
       </w:r>
+      <w:proofErr w:type="spellStart"/>
       <w:r>
         <w:rPr>
           <w:rFonts w:ascii="Courier New" w:hAnsi="Courier New" w:cs="Courier New"/>
         </w:rPr>
-        <w:t>ms -refuse</w:t>
+        <w:t>ms</w:t>
+      </w:r>
+      <w:proofErr w:type="spellEnd"/>
+      <w:r>
+        <w:rPr>
+          <w:rFonts w:ascii="Courier New" w:hAnsi="Courier New" w:cs="Courier New"/>
+        </w:rPr>
+        <w:t xml:space="preserve"> -refuse</w:t>
       </w:r>
     </w:p>
     <w:p>
@@ -5123,9 +5299,11 @@
       <w:r>
         <w:t>:&lt;</w:t>
       </w:r>
+      <w:proofErr w:type="spellStart"/>
       <w:r>
         <w:t>saved|run</w:t>
       </w:r>
+      <w:proofErr w:type="spellEnd"/>
       <w:r>
         <w:t>&gt;</w:t>
       </w:r>
@@ -5181,7 +5359,23 @@
           <w:b/>
           <w:bCs/>
         </w:rPr>
-        <w:t xml:space="preserve">-view: &lt;saved|run&gt; </w:t>
+        <w:t>-view: &lt;</w:t>
+      </w:r>
+      <w:proofErr w:type="spellStart"/>
+      <w:r>
+        <w:rPr>
+          <w:b/>
+          <w:bCs/>
+        </w:rPr>
+        <w:t>saved|run</w:t>
+      </w:r>
+      <w:proofErr w:type="spellEnd"/>
+      <w:r>
+        <w:rPr>
+          <w:b/>
+          <w:bCs/>
+        </w:rPr>
+        <w:t xml:space="preserve">&gt; </w:t>
       </w:r>
       <w:r>
         <w:t>=&gt; Indicate ‘saved’ to get the settings saved on the disk and ‘run’ for the settings in the RAM. It’s in JSON.</w:t>
@@ -5243,12 +5437,14 @@
       <w:r>
         <w:t xml:space="preserve"> </w:t>
       </w:r>
+      <w:proofErr w:type="spellStart"/>
       <w:r>
         <w:rPr>
           <w:rFonts w:ascii="Courier New" w:hAnsi="Courier New" w:cs="Courier New"/>
         </w:rPr>
         <w:t>hs</w:t>
       </w:r>
+      <w:proofErr w:type="spellEnd"/>
     </w:p>
     <w:p>
       <w:pPr>
@@ -5261,8 +5457,13 @@
         <w:t xml:space="preserve"> -</w:t>
       </w:r>
       <w:r>
-        <w:t>&lt;new_prefix</w:t>
-      </w:r>
+        <w:t>&lt;</w:t>
+      </w:r>
+      <w:proofErr w:type="spellStart"/>
+      <w:r>
+        <w:t>new_prefix</w:t>
+      </w:r>
+      <w:proofErr w:type="spellEnd"/>
       <w:r>
         <w:t>&gt;</w:t>
       </w:r>
@@ -5316,6 +5517,7 @@
         </w:rPr>
         <w:t>-&lt;</w:t>
       </w:r>
+      <w:proofErr w:type="spellStart"/>
       <w:r>
         <w:rPr>
           <w:b/>
@@ -5323,6 +5525,7 @@
         </w:rPr>
         <w:t>new_prefix</w:t>
       </w:r>
+      <w:proofErr w:type="spellEnd"/>
       <w:r>
         <w:rPr>
           <w:b/>
@@ -5345,8 +5548,13 @@
         <w:pStyle w:val="Titre2"/>
       </w:pPr>
       <w:r>
-        <w:t>DM commands</w:t>
-      </w:r>
+        <w:t xml:space="preserve">DM </w:t>
+      </w:r>
+      <w:proofErr w:type="spellStart"/>
+      <w:r>
+        <w:t>commands</w:t>
+      </w:r>
+      <w:proofErr w:type="spellEnd"/>
     </w:p>
     <w:p>
       <w:pPr>
@@ -5417,7 +5625,15 @@
       <w:bookmarkStart w:id="28" w:name="_info_-&lt;enable|disable&gt;"/>
       <w:bookmarkEnd w:id="28"/>
       <w:r>
-        <w:t>info -&lt;enable|disable&gt;</w:t>
+        <w:t>info -&lt;</w:t>
+      </w:r>
+      <w:proofErr w:type="spellStart"/>
+      <w:r>
+        <w:t>enable|disable</w:t>
+      </w:r>
+      <w:proofErr w:type="spellEnd"/>
+      <w:r>
+        <w:t>&gt;</w:t>
       </w:r>
     </w:p>
     <w:p>
@@ -5448,12 +5664,26 @@
         <w:rPr>
           <w:lang w:val="en-US"/>
         </w:rPr>
-        <w:t xml:space="preserve"> By default they are enable</w:t>
-      </w:r>
+        <w:t xml:space="preserve"> By </w:t>
+      </w:r>
+      <w:proofErr w:type="gramStart"/>
       <w:r>
         <w:rPr>
           <w:lang w:val="en-US"/>
         </w:rPr>
+        <w:t>default</w:t>
+      </w:r>
+      <w:proofErr w:type="gramEnd"/>
+      <w:r>
+        <w:rPr>
+          <w:lang w:val="en-US"/>
+        </w:rPr>
+        <w:t xml:space="preserve"> they are enable</w:t>
+      </w:r>
+      <w:r>
+        <w:rPr>
+          <w:lang w:val="en-US"/>
+        </w:rPr>
         <w:t>d</w:t>
       </w:r>
       <w:r>
@@ -5474,27 +5704,26 @@
           <w:b/>
           <w:bCs/>
         </w:rPr>
-        <w:t>-</w:t>
-      </w:r>
-      <w:r>
-        <w:rPr>
-          <w:b/>
-          <w:bCs/>
-        </w:rPr>
-        <w:t>&lt;enable|disable&gt;</w:t>
-      </w:r>
-      <w:r>
-        <w:rPr>
-          <w:b/>
-          <w:bCs/>
-        </w:rPr>
-        <w:t xml:space="preserve"> </w:t>
-      </w:r>
-      <w:r>
-        <w:t xml:space="preserve">=&gt; Indicate </w:t>
-      </w:r>
-      <w:r>
-        <w:t>‘disable’ to disable these messages else indicate ‘enable’.</w:t>
+        <w:t>-&lt;</w:t>
+      </w:r>
+      <w:proofErr w:type="spellStart"/>
+      <w:r>
+        <w:rPr>
+          <w:b/>
+          <w:bCs/>
+        </w:rPr>
+        <w:t>enable|disable</w:t>
+      </w:r>
+      <w:proofErr w:type="spellEnd"/>
+      <w:r>
+        <w:rPr>
+          <w:b/>
+          <w:bCs/>
+        </w:rPr>
+        <w:t xml:space="preserve">&gt; </w:t>
+      </w:r>
+      <w:r>
+        <w:t>=&gt; Indicate ‘disable’ to disable these messages else indicate ‘enable’.</w:t>
       </w:r>
     </w:p>
     <w:sectPr>

</xml_diff>